<commit_message>
Added more to the LFS doc.
</commit_message>
<xml_diff>
--- a/Life From Space.docx
+++ b/Life From Space.docx
@@ -27,10 +27,166 @@
         </w:numPr>
       </w:pPr>
       <w:r>
-        <w:t xml:space="preserve">The Board – Depicts Space and has clearly demarked zones for </w:t>
+        <w:rPr>
+          <w:b/>
+          <w:bCs/>
+        </w:rPr>
+        <w:t xml:space="preserve">1x </w:t>
+      </w:r>
+      <w:r>
+        <w:rPr>
+          <w:b/>
+          <w:bCs/>
+        </w:rPr>
+        <w:t>Board</w:t>
+      </w:r>
+      <w:r>
+        <w:t xml:space="preserve"> – Depicts Space and has clearly demarked zones for </w:t>
       </w:r>
       <w:r>
         <w:t>‘The Earth’, ‘The Interstellar Medium’ (Trading Post), ‘The Interstellar Nursery’</w:t>
+      </w:r>
+      <w:r>
+        <w:t>, and ‘Black Hole’.</w:t>
+      </w:r>
+    </w:p>
+    <w:p>
+      <w:pPr>
+        <w:pStyle w:val="ListParagraph"/>
+        <w:numPr>
+          <w:ilvl w:val="0"/>
+          <w:numId w:val="1"/>
+        </w:numPr>
+      </w:pPr>
+      <w:r>
+        <w:rPr>
+          <w:b/>
+          <w:bCs/>
+        </w:rPr>
+        <w:t xml:space="preserve">8x </w:t>
+      </w:r>
+      <w:r>
+        <w:rPr>
+          <w:b/>
+          <w:bCs/>
+        </w:rPr>
+        <w:t>Player Character Cards</w:t>
+      </w:r>
+      <w:r>
+        <w:t xml:space="preserve"> – Distinct personalities with a secret mission which earns more points if completed.</w:t>
+      </w:r>
+    </w:p>
+    <w:p>
+      <w:pPr>
+        <w:pStyle w:val="ListParagraph"/>
+        <w:numPr>
+          <w:ilvl w:val="0"/>
+          <w:numId w:val="1"/>
+        </w:numPr>
+      </w:pPr>
+      <w:r>
+        <w:rPr>
+          <w:b/>
+          <w:bCs/>
+        </w:rPr>
+        <w:t>6x Player trays</w:t>
+      </w:r>
+      <w:r>
+        <w:t xml:space="preserve">. Can be placed on the board as a space for the players to build their cosmic matter. Modular in nature </w:t>
+      </w:r>
+      <w:proofErr w:type="gramStart"/>
+      <w:r>
+        <w:t>in order to</w:t>
+      </w:r>
+      <w:proofErr w:type="gramEnd"/>
+      <w:r>
+        <w:t xml:space="preserve"> accommodate varying numbers of players.</w:t>
+      </w:r>
+    </w:p>
+    <w:p>
+      <w:pPr>
+        <w:pStyle w:val="ListParagraph"/>
+        <w:numPr>
+          <w:ilvl w:val="0"/>
+          <w:numId w:val="1"/>
+        </w:numPr>
+      </w:pPr>
+      <w:r>
+        <w:rPr>
+          <w:b/>
+          <w:bCs/>
+        </w:rPr>
+        <w:t xml:space="preserve">4x Earth Stage Cards </w:t>
+      </w:r>
+      <w:r>
+        <w:t>– Cards that represent the Earth in different stages, from molten lifeless rock to verdant home to burgeoning life.</w:t>
+      </w:r>
+    </w:p>
+    <w:p>
+      <w:pPr>
+        <w:pStyle w:val="ListParagraph"/>
+        <w:numPr>
+          <w:ilvl w:val="0"/>
+          <w:numId w:val="1"/>
+        </w:numPr>
+      </w:pPr>
+      <w:r>
+        <w:rPr>
+          <w:b/>
+          <w:bCs/>
+        </w:rPr>
+        <w:t xml:space="preserve">Phase Cards </w:t>
+      </w:r>
+      <w:r>
+        <w:t>– Used to inform the player as to what quantities of material need to go into the Interstellar Medium from the Big Bang.</w:t>
+      </w:r>
+    </w:p>
+    <w:p>
+      <w:pPr>
+        <w:pStyle w:val="ListParagraph"/>
+        <w:numPr>
+          <w:ilvl w:val="0"/>
+          <w:numId w:val="1"/>
+        </w:numPr>
+      </w:pPr>
+      <w:r>
+        <w:rPr>
+          <w:b/>
+          <w:bCs/>
+        </w:rPr>
+        <w:t xml:space="preserve">Resources </w:t>
+      </w:r>
+      <w:r>
+        <w:rPr>
+          <w:b/>
+          <w:bCs/>
+        </w:rPr>
+        <w:t xml:space="preserve">Tokens </w:t>
+      </w:r>
+      <w:r>
+        <w:t xml:space="preserve">– Hydrogen, Helium, Carbon through to more complex structures. </w:t>
+      </w:r>
+      <w:r>
+        <w:t xml:space="preserve">The less complex, more abundant resources will have tokens with higher amounts. </w:t>
+      </w:r>
+    </w:p>
+    <w:p>
+      <w:pPr>
+        <w:pStyle w:val="ListParagraph"/>
+        <w:numPr>
+          <w:ilvl w:val="1"/>
+          <w:numId w:val="1"/>
+        </w:numPr>
+      </w:pPr>
+      <w:r>
+        <w:rPr>
+          <w:b/>
+          <w:bCs/>
+        </w:rPr>
+        <w:t xml:space="preserve">Helium </w:t>
+      </w:r>
+      <w:r>
+        <w:t>will have token with face values ranging from 10 – 500 and have a higher number of tokens than other resources.</w:t>
       </w:r>
     </w:p>
     <w:sectPr>
@@ -61,7 +217,7 @@
         <w:rFonts w:ascii="Symbol" w:hAnsi="Symbol" w:hint="default"/>
       </w:rPr>
     </w:lvl>
-    <w:lvl w:ilvl="1" w:tplc="08090003" w:tentative="1">
+    <w:lvl w:ilvl="1" w:tplc="08090003">
       <w:start w:val="1"/>
       <w:numFmt w:val="bullet"/>
       <w:lvlText w:val="o"/>

</xml_diff>

<commit_message>
Started to add onto the Word doc. Need to continue with game phases
</commit_message>
<xml_diff>
--- a/Life From Space.docx
+++ b/Life From Space.docx
@@ -187,6 +187,116 @@
       </w:r>
       <w:r>
         <w:t>will have token with face values ranging from 10 – 500 and have a higher number of tokens than other resources.</w:t>
+      </w:r>
+    </w:p>
+    <w:p/>
+    <w:p>
+      <w:pPr>
+        <w:pStyle w:val="ListParagraph"/>
+        <w:numPr>
+          <w:ilvl w:val="0"/>
+          <w:numId w:val="2"/>
+        </w:numPr>
+        <w:rPr>
+          <w:b/>
+          <w:bCs/>
+        </w:rPr>
+      </w:pPr>
+      <w:r>
+        <w:rPr>
+          <w:b/>
+          <w:bCs/>
+        </w:rPr>
+        <w:t>Start of Game</w:t>
+      </w:r>
+      <w:r>
+        <w:rPr>
+          <w:b/>
+          <w:bCs/>
+        </w:rPr>
+        <w:t xml:space="preserve"> – </w:t>
+      </w:r>
+      <w:r>
+        <w:t xml:space="preserve">Basic resources placed on board and players select their character cards. They must </w:t>
+      </w:r>
+      <w:r>
+        <w:rPr>
+          <w:b/>
+          <w:bCs/>
+        </w:rPr>
+        <w:t>not</w:t>
+      </w:r>
+      <w:r>
+        <w:t xml:space="preserve"> reveal their character’s secret mission. Players collect X number of basic resources.</w:t>
+      </w:r>
+    </w:p>
+    <w:p>
+      <w:pPr>
+        <w:pStyle w:val="ListParagraph"/>
+        <w:numPr>
+          <w:ilvl w:val="0"/>
+          <w:numId w:val="2"/>
+        </w:numPr>
+        <w:rPr>
+          <w:b/>
+          <w:bCs/>
+        </w:rPr>
+      </w:pPr>
+      <w:r>
+        <w:rPr>
+          <w:b/>
+          <w:bCs/>
+        </w:rPr>
+        <w:t>Let there be Light –</w:t>
+      </w:r>
+      <w:r>
+        <w:t xml:space="preserve"> Each player must feed Hydrogen into the Interstellar Nursery to create The Sun. The resources will act as currency and require the players to work together – how much of their bank will they be willing to sacrifice for the communal good?</w:t>
+      </w:r>
+    </w:p>
+    <w:p>
+      <w:pPr>
+        <w:pStyle w:val="ListParagraph"/>
+        <w:numPr>
+          <w:ilvl w:val="0"/>
+          <w:numId w:val="2"/>
+        </w:numPr>
+        <w:rPr>
+          <w:b/>
+          <w:bCs/>
+        </w:rPr>
+      </w:pPr>
+      <w:r>
+        <w:rPr>
+          <w:b/>
+          <w:bCs/>
+        </w:rPr>
+        <w:t>Shockwave</w:t>
+      </w:r>
+      <w:r>
+        <w:rPr>
+          <w:b/>
+          <w:bCs/>
+        </w:rPr>
+        <w:t xml:space="preserve"> </w:t>
+      </w:r>
+      <w:r>
+        <w:rPr>
+          <w:b/>
+          <w:bCs/>
+        </w:rPr>
+        <w:t>–</w:t>
+      </w:r>
+      <w:r>
+        <w:t xml:space="preserve"> This may incur a </w:t>
+      </w:r>
+      <w:r>
+        <w:t xml:space="preserve">random </w:t>
+      </w:r>
+      <w:r>
+        <w:t>penalty</w:t>
+      </w:r>
+      <w:r>
+        <w:t xml:space="preserve">, such as removing a percentage of the lighter elements, or a boon, such as creating rare materials which they can either keep or trade. Each player takes a card from the Shockwave Deck and places it face-up.  </w:t>
       </w:r>
     </w:p>
     <w:sectPr>
@@ -229,7 +339,7 @@
         <w:rFonts w:ascii="Courier New" w:hAnsi="Courier New" w:cs="Courier New" w:hint="default"/>
       </w:rPr>
     </w:lvl>
-    <w:lvl w:ilvl="2" w:tplc="08090005" w:tentative="1">
+    <w:lvl w:ilvl="2" w:tplc="08090005">
       <w:start w:val="1"/>
       <w:numFmt w:val="bullet"/>
       <w:lvlText w:val=""/>
@@ -314,8 +424,124 @@
       </w:rPr>
     </w:lvl>
   </w:abstractNum>
+  <w:abstractNum w:abstractNumId="1" w15:restartNumberingAfterBreak="0">
+    <w:nsid w:val="57615EDF"/>
+    <w:multiLevelType w:val="hybridMultilevel"/>
+    <w:tmpl w:val="A19E9CE8"/>
+    <w:lvl w:ilvl="0" w:tplc="08090001">
+      <w:start w:val="1"/>
+      <w:numFmt w:val="bullet"/>
+      <w:lvlText w:val=""/>
+      <w:lvlJc w:val="left"/>
+      <w:pPr>
+        <w:ind w:left="720" w:hanging="360"/>
+      </w:pPr>
+      <w:rPr>
+        <w:rFonts w:ascii="Symbol" w:hAnsi="Symbol" w:hint="default"/>
+      </w:rPr>
+    </w:lvl>
+    <w:lvl w:ilvl="1" w:tplc="08090003" w:tentative="1">
+      <w:start w:val="1"/>
+      <w:numFmt w:val="bullet"/>
+      <w:lvlText w:val="o"/>
+      <w:lvlJc w:val="left"/>
+      <w:pPr>
+        <w:ind w:left="1440" w:hanging="360"/>
+      </w:pPr>
+      <w:rPr>
+        <w:rFonts w:ascii="Courier New" w:hAnsi="Courier New" w:cs="Courier New" w:hint="default"/>
+      </w:rPr>
+    </w:lvl>
+    <w:lvl w:ilvl="2" w:tplc="08090005" w:tentative="1">
+      <w:start w:val="1"/>
+      <w:numFmt w:val="bullet"/>
+      <w:lvlText w:val=""/>
+      <w:lvlJc w:val="left"/>
+      <w:pPr>
+        <w:ind w:left="2160" w:hanging="360"/>
+      </w:pPr>
+      <w:rPr>
+        <w:rFonts w:ascii="Wingdings" w:hAnsi="Wingdings" w:hint="default"/>
+      </w:rPr>
+    </w:lvl>
+    <w:lvl w:ilvl="3" w:tplc="08090001" w:tentative="1">
+      <w:start w:val="1"/>
+      <w:numFmt w:val="bullet"/>
+      <w:lvlText w:val=""/>
+      <w:lvlJc w:val="left"/>
+      <w:pPr>
+        <w:ind w:left="2880" w:hanging="360"/>
+      </w:pPr>
+      <w:rPr>
+        <w:rFonts w:ascii="Symbol" w:hAnsi="Symbol" w:hint="default"/>
+      </w:rPr>
+    </w:lvl>
+    <w:lvl w:ilvl="4" w:tplc="08090003" w:tentative="1">
+      <w:start w:val="1"/>
+      <w:numFmt w:val="bullet"/>
+      <w:lvlText w:val="o"/>
+      <w:lvlJc w:val="left"/>
+      <w:pPr>
+        <w:ind w:left="3600" w:hanging="360"/>
+      </w:pPr>
+      <w:rPr>
+        <w:rFonts w:ascii="Courier New" w:hAnsi="Courier New" w:cs="Courier New" w:hint="default"/>
+      </w:rPr>
+    </w:lvl>
+    <w:lvl w:ilvl="5" w:tplc="08090005" w:tentative="1">
+      <w:start w:val="1"/>
+      <w:numFmt w:val="bullet"/>
+      <w:lvlText w:val=""/>
+      <w:lvlJc w:val="left"/>
+      <w:pPr>
+        <w:ind w:left="4320" w:hanging="360"/>
+      </w:pPr>
+      <w:rPr>
+        <w:rFonts w:ascii="Wingdings" w:hAnsi="Wingdings" w:hint="default"/>
+      </w:rPr>
+    </w:lvl>
+    <w:lvl w:ilvl="6" w:tplc="08090001" w:tentative="1">
+      <w:start w:val="1"/>
+      <w:numFmt w:val="bullet"/>
+      <w:lvlText w:val=""/>
+      <w:lvlJc w:val="left"/>
+      <w:pPr>
+        <w:ind w:left="5040" w:hanging="360"/>
+      </w:pPr>
+      <w:rPr>
+        <w:rFonts w:ascii="Symbol" w:hAnsi="Symbol" w:hint="default"/>
+      </w:rPr>
+    </w:lvl>
+    <w:lvl w:ilvl="7" w:tplc="08090003" w:tentative="1">
+      <w:start w:val="1"/>
+      <w:numFmt w:val="bullet"/>
+      <w:lvlText w:val="o"/>
+      <w:lvlJc w:val="left"/>
+      <w:pPr>
+        <w:ind w:left="5760" w:hanging="360"/>
+      </w:pPr>
+      <w:rPr>
+        <w:rFonts w:ascii="Courier New" w:hAnsi="Courier New" w:cs="Courier New" w:hint="default"/>
+      </w:rPr>
+    </w:lvl>
+    <w:lvl w:ilvl="8" w:tplc="08090005" w:tentative="1">
+      <w:start w:val="1"/>
+      <w:numFmt w:val="bullet"/>
+      <w:lvlText w:val=""/>
+      <w:lvlJc w:val="left"/>
+      <w:pPr>
+        <w:ind w:left="6480" w:hanging="360"/>
+      </w:pPr>
+      <w:rPr>
+        <w:rFonts w:ascii="Wingdings" w:hAnsi="Wingdings" w:hint="default"/>
+      </w:rPr>
+    </w:lvl>
+  </w:abstractNum>
   <w:num w:numId="1" w16cid:durableId="2055811176">
     <w:abstractNumId w:val="0"/>
+  </w:num>
+  <w:num w:numId="2" w16cid:durableId="48650945">
+    <w:abstractNumId w:val="1"/>
   </w:num>
 </w:numbering>
 </file>

</xml_diff>

<commit_message>
Added more to Life From Space. Need to chat to Simon to finalise the rounds and win conditions
</commit_message>
<xml_diff>
--- a/Life From Space.docx
+++ b/Life From Space.docx
@@ -3,18 +3,137 @@
 <w:document xmlns:wpc="http://schemas.microsoft.com/office/word/2010/wordprocessingCanvas" xmlns:cx="http://schemas.microsoft.com/office/drawing/2014/chartex" xmlns:cx1="http://schemas.microsoft.com/office/drawing/2015/9/8/chartex" xmlns:cx2="http://schemas.microsoft.com/office/drawing/2015/10/21/chartex" xmlns:cx3="http://schemas.microsoft.com/office/drawing/2016/5/9/chartex" xmlns:cx4="http://schemas.microsoft.com/office/drawing/2016/5/10/chartex" xmlns:cx5="http://schemas.microsoft.com/office/drawing/2016/5/11/chartex" xmlns:cx6="http://schemas.microsoft.com/office/drawing/2016/5/12/chartex" xmlns:cx7="http://schemas.microsoft.com/office/drawing/2016/5/13/chartex" xmlns:cx8="http://schemas.microsoft.com/office/drawing/2016/5/14/chartex" xmlns:mc="http://schemas.openxmlformats.org/markup-compatibility/2006" xmlns:aink="http://schemas.microsoft.com/office/drawing/2016/ink" xmlns:am3d="http://schemas.microsoft.com/office/drawing/2017/model3d" xmlns:o="urn:schemas-microsoft-com:office:office" xmlns:oel="http://schemas.microsoft.com/office/2019/extlst" xmlns:r="http://schemas.openxmlformats.org/officeDocument/2006/relationships" xmlns:m="http://schemas.openxmlformats.org/officeDocument/2006/math" xmlns:v="urn:schemas-microsoft-com:vml" xmlns:wp14="http://schemas.microsoft.com/office/word/2010/wordprocessingDrawing" xmlns:wp="http://schemas.openxmlformats.org/drawingml/2006/wordprocessingDrawing" xmlns:w10="urn:schemas-microsoft-com:office:word" xmlns:w="http://schemas.openxmlformats.org/wordprocessingml/2006/main" xmlns:w14="http://schemas.microsoft.com/office/word/2010/wordml" xmlns:w15="http://schemas.microsoft.com/office/word/2012/wordml" xmlns:w16cex="http://schemas.microsoft.com/office/word/2018/wordml/cex" xmlns:w16cid="http://schemas.microsoft.com/office/word/2016/wordml/cid" xmlns:w16="http://schemas.microsoft.com/office/word/2018/wordml" xmlns:w16du="http://schemas.microsoft.com/office/word/2023/wordml/word16du" xmlns:w16sdtdh="http://schemas.microsoft.com/office/word/2020/wordml/sdtdatahash" xmlns:w16sdtfl="http://schemas.microsoft.com/office/word/2024/wordml/sdtformatlock" xmlns:w16se="http://schemas.microsoft.com/office/word/2015/wordml/symex" xmlns:wpg="http://schemas.microsoft.com/office/word/2010/wordprocessingGroup" xmlns:wpi="http://schemas.microsoft.com/office/word/2010/wordprocessingInk" xmlns:wne="http://schemas.microsoft.com/office/word/2006/wordml" xmlns:wps="http://schemas.microsoft.com/office/word/2010/wordprocessingShape" mc:Ignorable="w14 w15 w16se w16cid w16 w16cex w16sdtdh w16sdtfl w16du wp14">
   <w:body>
     <w:p>
-      <w:r>
+      <w:pPr>
+        <w:rPr>
+          <w:b/>
+          <w:bCs/>
+          <w:u w:val="single"/>
+        </w:rPr>
+      </w:pPr>
+      <w:r>
+        <w:rPr>
+          <w:b/>
+          <w:bCs/>
+          <w:u w:val="single"/>
+        </w:rPr>
         <w:t>Life From Space</w:t>
       </w:r>
     </w:p>
     <w:p>
       <w:r>
-        <w:t>‘It’s two minutes after the Big Bang…’</w:t>
+        <w:t>It’s two minutes after the Big Bang…</w:t>
+      </w:r>
+      <w:r>
+        <w:t xml:space="preserve"> </w:t>
+      </w:r>
+    </w:p>
+    <w:p>
+      <w:r>
+        <w:t>Amongst the storm of helium and hydrogen, strange and powerful beings are amassing with one objective in mind –</w:t>
+      </w:r>
+      <w:r>
+        <w:t xml:space="preserve"> To be the first one to</w:t>
+      </w:r>
+      <w:r>
+        <w:t xml:space="preserve"> </w:t>
+      </w:r>
+      <w:r>
+        <w:t>c</w:t>
+      </w:r>
+      <w:r>
+        <w:t>reate life from the</w:t>
+      </w:r>
+      <w:r>
+        <w:t xml:space="preserve"> dense and ever-evolving matter around them</w:t>
+      </w:r>
+      <w:r>
+        <w:t>.</w:t>
+      </w:r>
+      <w:r>
+        <w:t xml:space="preserve"> The task is challenging, as each being has a secret personal agenda to fulfil,</w:t>
+      </w:r>
+      <w:r>
+        <w:t xml:space="preserve"> which can be thwarted by the dangerous and unpredictable Shockwave Event.</w:t>
+      </w:r>
+      <w:r>
+        <w:t xml:space="preserve"> </w:t>
+      </w:r>
+      <w:r>
+        <w:t>In such a hos</w:t>
+      </w:r>
+      <w:r>
+        <w:t>t</w:t>
+      </w:r>
+      <w:r>
+        <w:t>ile environment they may find that</w:t>
+      </w:r>
+      <w:r>
+        <w:t xml:space="preserve"> they will need to trade and cooperate with other beings</w:t>
+      </w:r>
+      <w:r>
+        <w:t xml:space="preserve"> in order to complete their mission</w:t>
+      </w:r>
+      <w:r>
+        <w:t>.</w:t>
+      </w:r>
+      <w:r>
+        <w:t xml:space="preserve"> </w:t>
+      </w:r>
+    </w:p>
+    <w:p>
+      <w:r>
+        <w:t>Who will be the first to create life from space…</w:t>
+      </w:r>
+    </w:p>
+    <w:p>
+      <w:pPr>
+        <w:rPr>
+          <w:b/>
+          <w:bCs/>
+          <w:u w:val="single"/>
+        </w:rPr>
+      </w:pPr>
+      <w:r>
+        <w:rPr>
+          <w:b/>
+          <w:bCs/>
+          <w:u w:val="single"/>
+        </w:rPr>
+        <w:t>Game Overview</w:t>
+      </w:r>
+    </w:p>
+    <w:p>
+      <w:r>
+        <w:t xml:space="preserve">Life from Space is a collaborative/competitive game for upto </w:t>
+      </w:r>
+      <w:r>
+        <w:t>6</w:t>
+      </w:r>
+      <w:r>
+        <w:t xml:space="preserve"> players. Each player takes on the role of a powerful extraterrestial being, each with their own abilities and a secret mission, which is selected at random before game starts.</w:t>
+      </w:r>
+      <w:r>
+        <w:t xml:space="preserve"> Utilising only the raw elements created after the ‘Big Bang’, each player must trade commodities and collaborate over successive rounds to create the different states necessary to ensure that Earth can support life, whilst also advancing their own secret agenda. </w:t>
+      </w:r>
+    </w:p>
+    <w:p>
+      <w:r>
+        <w:t>Scoring takes place at the end of the game, with a single winner being declared.</w:t>
       </w:r>
     </w:p>
     <w:p/>
     <w:p>
-      <w:r>
+      <w:pPr>
+        <w:rPr>
+          <w:b/>
+          <w:bCs/>
+        </w:rPr>
+      </w:pPr>
+      <w:r>
+        <w:rPr>
+          <w:b/>
+          <w:bCs/>
+        </w:rPr>
         <w:t>Physical Game Components:</w:t>
       </w:r>
     </w:p>
@@ -89,18 +208,10 @@
           <w:b/>
           <w:bCs/>
         </w:rPr>
-        <w:t>6x Player trays</w:t>
-      </w:r>
-      <w:r>
-        <w:t xml:space="preserve">. Can be placed on the board as a space for the players to build their cosmic matter. Modular in nature </w:t>
-      </w:r>
-      <w:proofErr w:type="gramStart"/>
-      <w:r>
-        <w:t>in order to</w:t>
-      </w:r>
-      <w:proofErr w:type="gramEnd"/>
-      <w:r>
-        <w:t xml:space="preserve"> accommodate varying numbers of players.</w:t>
+        <w:t xml:space="preserve">Secret Agenda Cards </w:t>
+      </w:r>
+      <w:r>
+        <w:t>– A covert operation that the player must complete in order to score more points.</w:t>
       </w:r>
     </w:p>
     <w:p>
@@ -116,10 +227,17 @@
           <w:b/>
           <w:bCs/>
         </w:rPr>
-        <w:t xml:space="preserve">4x Earth Stage Cards </w:t>
-      </w:r>
-      <w:r>
-        <w:t>– Cards that represent the Earth in different stages, from molten lifeless rock to verdant home to burgeoning life.</w:t>
+        <w:t>6</w:t>
+      </w:r>
+      <w:r>
+        <w:rPr>
+          <w:b/>
+          <w:bCs/>
+        </w:rPr>
+        <w:t xml:space="preserve">x Player Character Mover Components </w:t>
+      </w:r>
+      <w:r>
+        <w:t>– A coloured component that represents the player on the board. Can only be moved on that player’s turn.</w:t>
       </w:r>
     </w:p>
     <w:p>
@@ -135,10 +253,10 @@
           <w:b/>
           <w:bCs/>
         </w:rPr>
-        <w:t xml:space="preserve">Phase Cards </w:t>
-      </w:r>
-      <w:r>
-        <w:t>– Used to inform the player as to what quantities of material need to go into the Interstellar Medium from the Big Bang.</w:t>
+        <w:t>6x Player trays</w:t>
+      </w:r>
+      <w:r>
+        <w:t>. Can be placed on the board as a space for the players to build their cosmic matter. Modular in nature in order to accommodate varying numbers of players.</w:t>
       </w:r>
     </w:p>
     <w:p>
@@ -154,6 +272,82 @@
           <w:b/>
           <w:bCs/>
         </w:rPr>
+        <w:t xml:space="preserve">4x Earth Stage Cards </w:t>
+      </w:r>
+      <w:r>
+        <w:t>– Cards that represent the Earth in different stages, from molten lifeless rock to verdant home to burgeoning life.</w:t>
+      </w:r>
+    </w:p>
+    <w:p>
+      <w:pPr>
+        <w:pStyle w:val="ListParagraph"/>
+        <w:numPr>
+          <w:ilvl w:val="0"/>
+          <w:numId w:val="1"/>
+        </w:numPr>
+      </w:pPr>
+      <w:r>
+        <w:rPr>
+          <w:b/>
+          <w:bCs/>
+        </w:rPr>
+        <w:t xml:space="preserve">Phase Cards </w:t>
+      </w:r>
+      <w:r>
+        <w:t>– Used to inform the player as to what quantities of material need to go into the Interstellar Medium from the Big Bang.</w:t>
+      </w:r>
+    </w:p>
+    <w:p>
+      <w:pPr>
+        <w:pStyle w:val="ListParagraph"/>
+        <w:numPr>
+          <w:ilvl w:val="0"/>
+          <w:numId w:val="1"/>
+        </w:numPr>
+      </w:pPr>
+      <w:r>
+        <w:rPr>
+          <w:b/>
+          <w:bCs/>
+        </w:rPr>
+        <w:t xml:space="preserve">Shockwave Cards </w:t>
+      </w:r>
+      <w:r>
+        <w:t>– A random boon or penalty applied to the elements on the board. This may involve removal of elements (penalty), or the creation of new or rare elements (boon).</w:t>
+      </w:r>
+    </w:p>
+    <w:p>
+      <w:pPr>
+        <w:pStyle w:val="ListParagraph"/>
+        <w:numPr>
+          <w:ilvl w:val="0"/>
+          <w:numId w:val="1"/>
+        </w:numPr>
+      </w:pPr>
+      <w:r>
+        <w:rPr>
+          <w:b/>
+          <w:bCs/>
+        </w:rPr>
+        <w:t xml:space="preserve">Molecule Cards </w:t>
+      </w:r>
+      <w:r>
+        <w:t>– These are complex structures that require building before they can be deployed. Each molecule displays the element and the number of that element needed before it can be completed.</w:t>
+      </w:r>
+    </w:p>
+    <w:p>
+      <w:pPr>
+        <w:pStyle w:val="ListParagraph"/>
+        <w:numPr>
+          <w:ilvl w:val="0"/>
+          <w:numId w:val="1"/>
+        </w:numPr>
+      </w:pPr>
+      <w:r>
+        <w:rPr>
+          <w:b/>
+          <w:bCs/>
+        </w:rPr>
         <w:t xml:space="preserve">Resources </w:t>
       </w:r>
       <w:r>
@@ -183,6 +377,7 @@
           <w:b/>
           <w:bCs/>
         </w:rPr>
+        <w:lastRenderedPageBreak/>
         <w:t xml:space="preserve">Helium </w:t>
       </w:r>
       <w:r>
@@ -214,10 +409,93 @@
           <w:b/>
           <w:bCs/>
         </w:rPr>
-        <w:t xml:space="preserve"> – </w:t>
-      </w:r>
-      <w:r>
-        <w:t xml:space="preserve">Basic resources placed on board and players select their character cards. They must </w:t>
+        <w:t xml:space="preserve"> –</w:t>
+      </w:r>
+    </w:p>
+    <w:p>
+      <w:pPr>
+        <w:pStyle w:val="ListParagraph"/>
+        <w:rPr>
+          <w:b/>
+          <w:bCs/>
+        </w:rPr>
+      </w:pPr>
+    </w:p>
+    <w:p>
+      <w:pPr>
+        <w:pStyle w:val="ListParagraph"/>
+        <w:numPr>
+          <w:ilvl w:val="1"/>
+          <w:numId w:val="2"/>
+        </w:numPr>
+        <w:rPr>
+          <w:b/>
+          <w:bCs/>
+        </w:rPr>
+      </w:pPr>
+      <w:r>
+        <w:t>Starting</w:t>
+      </w:r>
+      <w:r>
+        <w:t xml:space="preserve"> resources</w:t>
+      </w:r>
+      <w:r>
+        <w:t xml:space="preserve"> </w:t>
+      </w:r>
+      <w:r>
+        <w:t xml:space="preserve">and </w:t>
+      </w:r>
+      <w:r>
+        <w:t>are</w:t>
+      </w:r>
+      <w:r>
+        <w:t xml:space="preserve"> placed on board</w:t>
+      </w:r>
+      <w:r>
+        <w:t xml:space="preserve"> in the ‘Big Bang’ opening zone. The quantity of each resource will depend on the number of players involved. Refer to the Quick Reference sheet for guidance.</w:t>
+      </w:r>
+    </w:p>
+    <w:p>
+      <w:pPr>
+        <w:pStyle w:val="ListParagraph"/>
+        <w:numPr>
+          <w:ilvl w:val="1"/>
+          <w:numId w:val="2"/>
+        </w:numPr>
+        <w:rPr>
+          <w:b/>
+          <w:bCs/>
+        </w:rPr>
+      </w:pPr>
+      <w:r>
+        <w:t>P</w:t>
+      </w:r>
+      <w:r>
+        <w:t xml:space="preserve">layers select </w:t>
+      </w:r>
+      <w:r>
+        <w:t xml:space="preserve">randomly select </w:t>
+      </w:r>
+      <w:r>
+        <w:t xml:space="preserve">their </w:t>
+      </w:r>
+      <w:r>
+        <w:t>C</w:t>
+      </w:r>
+      <w:r>
+        <w:t>haracter cards</w:t>
+      </w:r>
+      <w:r>
+        <w:t xml:space="preserve"> and one Secret Agenda card</w:t>
+      </w:r>
+      <w:r>
+        <w:t xml:space="preserve">. </w:t>
+      </w:r>
+      <w:r>
+        <w:t>Players</w:t>
+      </w:r>
+      <w:r>
+        <w:t xml:space="preserve"> must </w:t>
       </w:r>
       <w:r>
         <w:rPr>
@@ -227,8 +505,43 @@
         <w:t>not</w:t>
       </w:r>
       <w:r>
-        <w:t xml:space="preserve"> reveal their character’s secret mission. Players collect X number of basic resources.</w:t>
-      </w:r>
+        <w:t xml:space="preserve"> reveal their character’s secret </w:t>
+      </w:r>
+      <w:r>
+        <w:t>Agenda to any other player</w:t>
+      </w:r>
+      <w:r>
+        <w:t xml:space="preserve">. </w:t>
+      </w:r>
+    </w:p>
+    <w:p>
+      <w:pPr>
+        <w:pStyle w:val="ListParagraph"/>
+        <w:numPr>
+          <w:ilvl w:val="1"/>
+          <w:numId w:val="2"/>
+        </w:numPr>
+        <w:rPr>
+          <w:b/>
+          <w:bCs/>
+        </w:rPr>
+      </w:pPr>
+      <w:r>
+        <w:t>Each player selects a coloured Mover Component.</w:t>
+      </w:r>
+      <w:r>
+        <w:t xml:space="preserve"> This will represent them on the board.</w:t>
+      </w:r>
+    </w:p>
+    <w:p>
+      <w:pPr>
+        <w:pStyle w:val="ListParagraph"/>
+        <w:ind w:left="1440"/>
+        <w:rPr>
+          <w:b/>
+          <w:bCs/>
+        </w:rPr>
+      </w:pPr>
     </w:p>
     <w:p>
       <w:pPr>
@@ -247,10 +560,20 @@
           <w:b/>
           <w:bCs/>
         </w:rPr>
-        <w:t>Let there be Light –</w:t>
-      </w:r>
-      <w:r>
-        <w:t xml:space="preserve"> Each player must feed Hydrogen into the Interstellar Nursery to create The Sun. The resources will act as currency and require the players to work together – how much of their bank will they be willing to sacrifice for the communal good?</w:t>
+        <w:t>Distribution of starting resources</w:t>
+      </w:r>
+      <w:r>
+        <w:t xml:space="preserve"> </w:t>
+      </w:r>
+      <w:r>
+        <w:rPr>
+          <w:b/>
+          <w:bCs/>
+        </w:rPr>
+        <w:t xml:space="preserve">– </w:t>
+      </w:r>
+      <w:r>
+        <w:t>Each player takes a Phase Card and moves the stated number of elements to the Interstellar Medium. This quanity may be modified by the Player Character card.</w:t>
       </w:r>
     </w:p>
     <w:p>
@@ -270,6 +593,47 @@
           <w:b/>
           <w:bCs/>
         </w:rPr>
+        <w:t>Let there be Light –</w:t>
+      </w:r>
+      <w:r>
+        <w:t xml:space="preserve"> Each player must </w:t>
+      </w:r>
+      <w:r>
+        <w:t>gather</w:t>
+      </w:r>
+      <w:r>
+        <w:t xml:space="preserve"> </w:t>
+      </w:r>
+      <w:r>
+        <w:t>hydrogen and helium</w:t>
+      </w:r>
+      <w:r>
+        <w:t xml:space="preserve"> </w:t>
+      </w:r>
+      <w:r>
+        <w:t>from</w:t>
+      </w:r>
+      <w:r>
+        <w:t xml:space="preserve"> the Interstellar Nursery to create The Sun. The resources act as currency and require the players to work together – how much of their bank will they be willing to sacrifice for the communal good?</w:t>
+      </w:r>
+    </w:p>
+    <w:p>
+      <w:pPr>
+        <w:pStyle w:val="ListParagraph"/>
+        <w:numPr>
+          <w:ilvl w:val="0"/>
+          <w:numId w:val="2"/>
+        </w:numPr>
+        <w:rPr>
+          <w:b/>
+          <w:bCs/>
+        </w:rPr>
+      </w:pPr>
+      <w:r>
+        <w:rPr>
+          <w:b/>
+          <w:bCs/>
+        </w:rPr>
         <w:t>Shockwave</w:t>
       </w:r>
       <w:r>
@@ -284,6 +648,13 @@
           <w:b/>
           <w:bCs/>
         </w:rPr>
+        <w:t xml:space="preserve">Phase </w:t>
+      </w:r>
+      <w:r>
+        <w:rPr>
+          <w:b/>
+          <w:bCs/>
+        </w:rPr>
         <w:t>–</w:t>
       </w:r>
       <w:r>
@@ -296,7 +667,150 @@
         <w:t>penalty</w:t>
       </w:r>
       <w:r>
-        <w:t xml:space="preserve">, such as removing a percentage of the lighter elements, or a boon, such as creating rare materials which they can either keep or trade. Each player takes a card from the Shockwave Deck and places it face-up.  </w:t>
+        <w:t xml:space="preserve">, such as removing a percentage of the lighter elements, or a boon, such as creating rare materials which they can either keep or trade. Each player takes a card from the Shockwave Deck and places it face-up. </w:t>
+      </w:r>
+      <w:r>
+        <w:t>The Player Character card may increase or reduce the effect of the Shockwave Phase.</w:t>
+      </w:r>
+      <w:r>
+        <w:t xml:space="preserve"> The Shockwave Phase is essential for progressing the game, as this is the </w:t>
+      </w:r>
+      <w:r>
+        <w:rPr>
+          <w:i/>
+          <w:iCs/>
+        </w:rPr>
+        <w:t>only</w:t>
+      </w:r>
+      <w:r>
+        <w:t xml:space="preserve"> way to produce new elements.</w:t>
+      </w:r>
+    </w:p>
+    <w:p/>
+    <w:p>
+      <w:pPr>
+        <w:rPr>
+          <w:b/>
+          <w:bCs/>
+        </w:rPr>
+      </w:pPr>
+      <w:r>
+        <w:rPr>
+          <w:b/>
+          <w:bCs/>
+        </w:rPr>
+        <w:t>Player Character Cards.</w:t>
+      </w:r>
+    </w:p>
+    <w:p>
+      <w:r>
+        <w:t>Each card contains:</w:t>
+      </w:r>
+    </w:p>
+    <w:p>
+      <w:pPr>
+        <w:pStyle w:val="ListParagraph"/>
+        <w:numPr>
+          <w:ilvl w:val="0"/>
+          <w:numId w:val="3"/>
+        </w:numPr>
+      </w:pPr>
+      <w:r>
+        <w:t>Name and image of the character.</w:t>
+      </w:r>
+    </w:p>
+    <w:p>
+      <w:pPr>
+        <w:pStyle w:val="ListParagraph"/>
+        <w:numPr>
+          <w:ilvl w:val="0"/>
+          <w:numId w:val="3"/>
+        </w:numPr>
+      </w:pPr>
+      <w:r>
+        <w:t>A brief background to the character – Some fictional flavour that can tie into their special abilities.</w:t>
+      </w:r>
+    </w:p>
+    <w:p>
+      <w:pPr>
+        <w:pStyle w:val="ListParagraph"/>
+        <w:numPr>
+          <w:ilvl w:val="0"/>
+          <w:numId w:val="3"/>
+        </w:numPr>
+      </w:pPr>
+      <w:r>
+        <w:t xml:space="preserve">Special Abilities – For example, Helios may have a buff </w:t>
+      </w:r>
+      <w:r>
+        <w:t>towards gathering more Hydrogen to create the sun. (For a buff there ought to be a nerf, or if there is only a buff then it may be more effective in the early, mid or late game. It shouldn’t be an overall advantage).</w:t>
+      </w:r>
+    </w:p>
+    <w:p>
+      <w:pPr>
+        <w:rPr>
+          <w:b/>
+          <w:bCs/>
+        </w:rPr>
+      </w:pPr>
+      <w:r>
+        <w:rPr>
+          <w:b/>
+          <w:bCs/>
+        </w:rPr>
+        <w:t>Secret Agenda Card</w:t>
+      </w:r>
+      <w:r>
+        <w:rPr>
+          <w:b/>
+          <w:bCs/>
+        </w:rPr>
+        <w:t>s.</w:t>
+      </w:r>
+    </w:p>
+    <w:p>
+      <w:r>
+        <w:t>Each card contains:</w:t>
+      </w:r>
+    </w:p>
+    <w:p>
+      <w:pPr>
+        <w:pStyle w:val="ListParagraph"/>
+        <w:numPr>
+          <w:ilvl w:val="0"/>
+          <w:numId w:val="4"/>
+        </w:numPr>
+      </w:pPr>
+      <w:r>
+        <w:t>An image representing the agenda.</w:t>
+      </w:r>
+    </w:p>
+    <w:p>
+      <w:pPr>
+        <w:pStyle w:val="ListParagraph"/>
+        <w:numPr>
+          <w:ilvl w:val="0"/>
+          <w:numId w:val="4"/>
+        </w:numPr>
+      </w:pPr>
+      <w:r>
+        <w:t>The agenda itself (</w:t>
+      </w:r>
+      <w:r>
+        <w:t>Collect X amount of X – These will be a mixture of common and rare materials in order to give the players the opportunity to start fulfilling their agenda early on in the game).</w:t>
+      </w:r>
+    </w:p>
+    <w:p>
+      <w:pPr>
+        <w:pStyle w:val="ListParagraph"/>
+        <w:numPr>
+          <w:ilvl w:val="0"/>
+          <w:numId w:val="4"/>
+        </w:numPr>
+      </w:pPr>
+      <w:r>
+        <w:lastRenderedPageBreak/>
+        <w:t>The number of points awarded on succesful completion of the agenda.</w:t>
       </w:r>
     </w:p>
     <w:sectPr>
@@ -312,6 +826,119 @@
 <file path=word/numbering.xml><?xml version="1.0" encoding="utf-8"?>
 <w:numbering xmlns:wpc="http://schemas.microsoft.com/office/word/2010/wordprocessingCanvas" xmlns:cx="http://schemas.microsoft.com/office/drawing/2014/chartex" xmlns:cx1="http://schemas.microsoft.com/office/drawing/2015/9/8/chartex" xmlns:cx2="http://schemas.microsoft.com/office/drawing/2015/10/21/chartex" xmlns:cx3="http://schemas.microsoft.com/office/drawing/2016/5/9/chartex" xmlns:cx4="http://schemas.microsoft.com/office/drawing/2016/5/10/chartex" xmlns:cx5="http://schemas.microsoft.com/office/drawing/2016/5/11/chartex" xmlns:cx6="http://schemas.microsoft.com/office/drawing/2016/5/12/chartex" xmlns:cx7="http://schemas.microsoft.com/office/drawing/2016/5/13/chartex" xmlns:cx8="http://schemas.microsoft.com/office/drawing/2016/5/14/chartex" xmlns:mc="http://schemas.openxmlformats.org/markup-compatibility/2006" xmlns:aink="http://schemas.microsoft.com/office/drawing/2016/ink" xmlns:am3d="http://schemas.microsoft.com/office/drawing/2017/model3d" xmlns:o="urn:schemas-microsoft-com:office:office" xmlns:oel="http://schemas.microsoft.com/office/2019/extlst" xmlns:r="http://schemas.openxmlformats.org/officeDocument/2006/relationships" xmlns:m="http://schemas.openxmlformats.org/officeDocument/2006/math" xmlns:v="urn:schemas-microsoft-com:vml" xmlns:wp14="http://schemas.microsoft.com/office/word/2010/wordprocessingDrawing" xmlns:wp="http://schemas.openxmlformats.org/drawingml/2006/wordprocessingDrawing" xmlns:w10="urn:schemas-microsoft-com:office:word" xmlns:w="http://schemas.openxmlformats.org/wordprocessingml/2006/main" xmlns:w14="http://schemas.microsoft.com/office/word/2010/wordml" xmlns:w15="http://schemas.microsoft.com/office/word/2012/wordml" xmlns:w16cex="http://schemas.microsoft.com/office/word/2018/wordml/cex" xmlns:w16cid="http://schemas.microsoft.com/office/word/2016/wordml/cid" xmlns:w16="http://schemas.microsoft.com/office/word/2018/wordml" xmlns:w16du="http://schemas.microsoft.com/office/word/2023/wordml/word16du" xmlns:w16sdtdh="http://schemas.microsoft.com/office/word/2020/wordml/sdtdatahash" xmlns:w16sdtfl="http://schemas.microsoft.com/office/word/2024/wordml/sdtformatlock" xmlns:w16se="http://schemas.microsoft.com/office/word/2015/wordml/symex" xmlns:wpg="http://schemas.microsoft.com/office/word/2010/wordprocessingGroup" xmlns:wpi="http://schemas.microsoft.com/office/word/2010/wordprocessingInk" xmlns:wne="http://schemas.microsoft.com/office/word/2006/wordml" xmlns:wps="http://schemas.microsoft.com/office/word/2010/wordprocessingShape" mc:Ignorable="w14 w15 w16se w16cid w16 w16cex w16sdtdh w16sdtfl w16du wp14">
   <w:abstractNum w:abstractNumId="0" w15:restartNumberingAfterBreak="0">
+    <w:nsid w:val="1D2416A8"/>
+    <w:multiLevelType w:val="hybridMultilevel"/>
+    <w:tmpl w:val="D78E0F38"/>
+    <w:lvl w:ilvl="0" w:tplc="08090001">
+      <w:start w:val="1"/>
+      <w:numFmt w:val="bullet"/>
+      <w:lvlText w:val=""/>
+      <w:lvlJc w:val="left"/>
+      <w:pPr>
+        <w:ind w:left="720" w:hanging="360"/>
+      </w:pPr>
+      <w:rPr>
+        <w:rFonts w:ascii="Symbol" w:hAnsi="Symbol" w:hint="default"/>
+      </w:rPr>
+    </w:lvl>
+    <w:lvl w:ilvl="1" w:tplc="08090003" w:tentative="1">
+      <w:start w:val="1"/>
+      <w:numFmt w:val="bullet"/>
+      <w:lvlText w:val="o"/>
+      <w:lvlJc w:val="left"/>
+      <w:pPr>
+        <w:ind w:left="1440" w:hanging="360"/>
+      </w:pPr>
+      <w:rPr>
+        <w:rFonts w:ascii="Courier New" w:hAnsi="Courier New" w:cs="Courier New" w:hint="default"/>
+      </w:rPr>
+    </w:lvl>
+    <w:lvl w:ilvl="2" w:tplc="08090005" w:tentative="1">
+      <w:start w:val="1"/>
+      <w:numFmt w:val="bullet"/>
+      <w:lvlText w:val=""/>
+      <w:lvlJc w:val="left"/>
+      <w:pPr>
+        <w:ind w:left="2160" w:hanging="360"/>
+      </w:pPr>
+      <w:rPr>
+        <w:rFonts w:ascii="Wingdings" w:hAnsi="Wingdings" w:hint="default"/>
+      </w:rPr>
+    </w:lvl>
+    <w:lvl w:ilvl="3" w:tplc="08090001" w:tentative="1">
+      <w:start w:val="1"/>
+      <w:numFmt w:val="bullet"/>
+      <w:lvlText w:val=""/>
+      <w:lvlJc w:val="left"/>
+      <w:pPr>
+        <w:ind w:left="2880" w:hanging="360"/>
+      </w:pPr>
+      <w:rPr>
+        <w:rFonts w:ascii="Symbol" w:hAnsi="Symbol" w:hint="default"/>
+      </w:rPr>
+    </w:lvl>
+    <w:lvl w:ilvl="4" w:tplc="08090003" w:tentative="1">
+      <w:start w:val="1"/>
+      <w:numFmt w:val="bullet"/>
+      <w:lvlText w:val="o"/>
+      <w:lvlJc w:val="left"/>
+      <w:pPr>
+        <w:ind w:left="3600" w:hanging="360"/>
+      </w:pPr>
+      <w:rPr>
+        <w:rFonts w:ascii="Courier New" w:hAnsi="Courier New" w:cs="Courier New" w:hint="default"/>
+      </w:rPr>
+    </w:lvl>
+    <w:lvl w:ilvl="5" w:tplc="08090005" w:tentative="1">
+      <w:start w:val="1"/>
+      <w:numFmt w:val="bullet"/>
+      <w:lvlText w:val=""/>
+      <w:lvlJc w:val="left"/>
+      <w:pPr>
+        <w:ind w:left="4320" w:hanging="360"/>
+      </w:pPr>
+      <w:rPr>
+        <w:rFonts w:ascii="Wingdings" w:hAnsi="Wingdings" w:hint="default"/>
+      </w:rPr>
+    </w:lvl>
+    <w:lvl w:ilvl="6" w:tplc="08090001" w:tentative="1">
+      <w:start w:val="1"/>
+      <w:numFmt w:val="bullet"/>
+      <w:lvlText w:val=""/>
+      <w:lvlJc w:val="left"/>
+      <w:pPr>
+        <w:ind w:left="5040" w:hanging="360"/>
+      </w:pPr>
+      <w:rPr>
+        <w:rFonts w:ascii="Symbol" w:hAnsi="Symbol" w:hint="default"/>
+      </w:rPr>
+    </w:lvl>
+    <w:lvl w:ilvl="7" w:tplc="08090003" w:tentative="1">
+      <w:start w:val="1"/>
+      <w:numFmt w:val="bullet"/>
+      <w:lvlText w:val="o"/>
+      <w:lvlJc w:val="left"/>
+      <w:pPr>
+        <w:ind w:left="5760" w:hanging="360"/>
+      </w:pPr>
+      <w:rPr>
+        <w:rFonts w:ascii="Courier New" w:hAnsi="Courier New" w:cs="Courier New" w:hint="default"/>
+      </w:rPr>
+    </w:lvl>
+    <w:lvl w:ilvl="8" w:tplc="08090005" w:tentative="1">
+      <w:start w:val="1"/>
+      <w:numFmt w:val="bullet"/>
+      <w:lvlText w:val=""/>
+      <w:lvlJc w:val="left"/>
+      <w:pPr>
+        <w:ind w:left="6480" w:hanging="360"/>
+      </w:pPr>
+      <w:rPr>
+        <w:rFonts w:ascii="Wingdings" w:hAnsi="Wingdings" w:hint="default"/>
+      </w:rPr>
+    </w:lvl>
+  </w:abstractNum>
+  <w:abstractNum w:abstractNumId="1" w15:restartNumberingAfterBreak="0">
     <w:nsid w:val="4EB53AAA"/>
     <w:multiLevelType w:val="hybridMultilevel"/>
     <w:tmpl w:val="7EC02AB4"/>
@@ -424,7 +1051,7 @@
       </w:rPr>
     </w:lvl>
   </w:abstractNum>
-  <w:abstractNum w:abstractNumId="1" w15:restartNumberingAfterBreak="0">
+  <w:abstractNum w:abstractNumId="2" w15:restartNumberingAfterBreak="0">
     <w:nsid w:val="57615EDF"/>
     <w:multiLevelType w:val="hybridMultilevel"/>
     <w:tmpl w:val="A19E9CE8"/>
@@ -440,6 +1067,119 @@
         <w:rFonts w:ascii="Symbol" w:hAnsi="Symbol" w:hint="default"/>
       </w:rPr>
     </w:lvl>
+    <w:lvl w:ilvl="1" w:tplc="08090003">
+      <w:start w:val="1"/>
+      <w:numFmt w:val="bullet"/>
+      <w:lvlText w:val="o"/>
+      <w:lvlJc w:val="left"/>
+      <w:pPr>
+        <w:ind w:left="1440" w:hanging="360"/>
+      </w:pPr>
+      <w:rPr>
+        <w:rFonts w:ascii="Courier New" w:hAnsi="Courier New" w:cs="Courier New" w:hint="default"/>
+      </w:rPr>
+    </w:lvl>
+    <w:lvl w:ilvl="2" w:tplc="08090005" w:tentative="1">
+      <w:start w:val="1"/>
+      <w:numFmt w:val="bullet"/>
+      <w:lvlText w:val=""/>
+      <w:lvlJc w:val="left"/>
+      <w:pPr>
+        <w:ind w:left="2160" w:hanging="360"/>
+      </w:pPr>
+      <w:rPr>
+        <w:rFonts w:ascii="Wingdings" w:hAnsi="Wingdings" w:hint="default"/>
+      </w:rPr>
+    </w:lvl>
+    <w:lvl w:ilvl="3" w:tplc="08090001" w:tentative="1">
+      <w:start w:val="1"/>
+      <w:numFmt w:val="bullet"/>
+      <w:lvlText w:val=""/>
+      <w:lvlJc w:val="left"/>
+      <w:pPr>
+        <w:ind w:left="2880" w:hanging="360"/>
+      </w:pPr>
+      <w:rPr>
+        <w:rFonts w:ascii="Symbol" w:hAnsi="Symbol" w:hint="default"/>
+      </w:rPr>
+    </w:lvl>
+    <w:lvl w:ilvl="4" w:tplc="08090003" w:tentative="1">
+      <w:start w:val="1"/>
+      <w:numFmt w:val="bullet"/>
+      <w:lvlText w:val="o"/>
+      <w:lvlJc w:val="left"/>
+      <w:pPr>
+        <w:ind w:left="3600" w:hanging="360"/>
+      </w:pPr>
+      <w:rPr>
+        <w:rFonts w:ascii="Courier New" w:hAnsi="Courier New" w:cs="Courier New" w:hint="default"/>
+      </w:rPr>
+    </w:lvl>
+    <w:lvl w:ilvl="5" w:tplc="08090005" w:tentative="1">
+      <w:start w:val="1"/>
+      <w:numFmt w:val="bullet"/>
+      <w:lvlText w:val=""/>
+      <w:lvlJc w:val="left"/>
+      <w:pPr>
+        <w:ind w:left="4320" w:hanging="360"/>
+      </w:pPr>
+      <w:rPr>
+        <w:rFonts w:ascii="Wingdings" w:hAnsi="Wingdings" w:hint="default"/>
+      </w:rPr>
+    </w:lvl>
+    <w:lvl w:ilvl="6" w:tplc="08090001" w:tentative="1">
+      <w:start w:val="1"/>
+      <w:numFmt w:val="bullet"/>
+      <w:lvlText w:val=""/>
+      <w:lvlJc w:val="left"/>
+      <w:pPr>
+        <w:ind w:left="5040" w:hanging="360"/>
+      </w:pPr>
+      <w:rPr>
+        <w:rFonts w:ascii="Symbol" w:hAnsi="Symbol" w:hint="default"/>
+      </w:rPr>
+    </w:lvl>
+    <w:lvl w:ilvl="7" w:tplc="08090003" w:tentative="1">
+      <w:start w:val="1"/>
+      <w:numFmt w:val="bullet"/>
+      <w:lvlText w:val="o"/>
+      <w:lvlJc w:val="left"/>
+      <w:pPr>
+        <w:ind w:left="5760" w:hanging="360"/>
+      </w:pPr>
+      <w:rPr>
+        <w:rFonts w:ascii="Courier New" w:hAnsi="Courier New" w:cs="Courier New" w:hint="default"/>
+      </w:rPr>
+    </w:lvl>
+    <w:lvl w:ilvl="8" w:tplc="08090005" w:tentative="1">
+      <w:start w:val="1"/>
+      <w:numFmt w:val="bullet"/>
+      <w:lvlText w:val=""/>
+      <w:lvlJc w:val="left"/>
+      <w:pPr>
+        <w:ind w:left="6480" w:hanging="360"/>
+      </w:pPr>
+      <w:rPr>
+        <w:rFonts w:ascii="Wingdings" w:hAnsi="Wingdings" w:hint="default"/>
+      </w:rPr>
+    </w:lvl>
+  </w:abstractNum>
+  <w:abstractNum w:abstractNumId="3" w15:restartNumberingAfterBreak="0">
+    <w:nsid w:val="7C116E5F"/>
+    <w:multiLevelType w:val="hybridMultilevel"/>
+    <w:tmpl w:val="FE7C6438"/>
+    <w:lvl w:ilvl="0" w:tplc="08090001">
+      <w:start w:val="1"/>
+      <w:numFmt w:val="bullet"/>
+      <w:lvlText w:val=""/>
+      <w:lvlJc w:val="left"/>
+      <w:pPr>
+        <w:ind w:left="720" w:hanging="360"/>
+      </w:pPr>
+      <w:rPr>
+        <w:rFonts w:ascii="Symbol" w:hAnsi="Symbol" w:hint="default"/>
+      </w:rPr>
+    </w:lvl>
     <w:lvl w:ilvl="1" w:tplc="08090003" w:tentative="1">
       <w:start w:val="1"/>
       <w:numFmt w:val="bullet"/>
@@ -538,10 +1278,16 @@
     </w:lvl>
   </w:abstractNum>
   <w:num w:numId="1" w16cid:durableId="2055811176">
-    <w:abstractNumId w:val="0"/>
+    <w:abstractNumId w:val="1"/>
   </w:num>
   <w:num w:numId="2" w16cid:durableId="48650945">
-    <w:abstractNumId w:val="1"/>
+    <w:abstractNumId w:val="2"/>
+  </w:num>
+  <w:num w:numId="3" w16cid:durableId="1918857163">
+    <w:abstractNumId w:val="3"/>
+  </w:num>
+  <w:num w:numId="4" w16cid:durableId="1247107485">
+    <w:abstractNumId w:val="0"/>
   </w:num>
 </w:numbering>
 </file>

</xml_diff>

<commit_message>
Added time as a factor
</commit_message>
<xml_diff>
--- a/Life From Space.docx
+++ b/Life From Space.docx
@@ -20,6 +20,21 @@
       </w:r>
     </w:p>
     <w:p>
+      <w:pPr>
+        <w:rPr>
+          <w:b/>
+          <w:bCs/>
+        </w:rPr>
+      </w:pPr>
+      <w:r>
+        <w:rPr>
+          <w:b/>
+          <w:bCs/>
+        </w:rPr>
+        <w:t>13.8 billion years ago</w:t>
+      </w:r>
+    </w:p>
+    <w:p>
       <w:r>
         <w:t>It’s two minutes after the Big Bang…</w:t>
       </w:r>
@@ -104,13 +119,25 @@
     </w:p>
     <w:p>
       <w:r>
-        <w:t xml:space="preserve">Life from Space is a collaborative/competitive game for upto </w:t>
+        <w:t xml:space="preserve">Life from Space is a collaborative/competitive game for </w:t>
+      </w:r>
+      <w:r>
+        <w:t>up to</w:t>
+      </w:r>
+      <w:r>
+        <w:t xml:space="preserve"> </w:t>
       </w:r>
       <w:r>
         <w:t>6</w:t>
       </w:r>
       <w:r>
-        <w:t xml:space="preserve"> players. Each player takes on the role of a powerful extraterrestial being, each with their own abilities and a secret mission, which is selected at random before game starts.</w:t>
+        <w:t xml:space="preserve"> players. Each player takes on the role of a powerful </w:t>
+      </w:r>
+      <w:r>
+        <w:t>extraterrestrial</w:t>
+      </w:r>
+      <w:r>
+        <w:t xml:space="preserve"> being, each with their own abilities and a secret mission, which is selected at random before game starts.</w:t>
       </w:r>
       <w:r>
         <w:t xml:space="preserve"> Utilising only the raw elements created after the ‘Big Bang’, each player must trade commodities and collaborate over successive rounds to create the different states necessary to ensure that Earth can support life, whilst also advancing their own secret agenda. </w:t>
@@ -361,7 +388,42 @@
         <w:t xml:space="preserve">– Hydrogen, Helium, Carbon through to more complex structures. </w:t>
       </w:r>
       <w:r>
-        <w:t xml:space="preserve">The less complex, more abundant resources will have tokens with higher amounts. </w:t>
+        <w:t>The less complex, more abundant resources will have tokens with higher amounts</w:t>
+      </w:r>
+      <w:r>
+        <w:t xml:space="preserve"> </w:t>
+      </w:r>
+      <w:r>
+        <w:lastRenderedPageBreak/>
+        <w:t>available</w:t>
+      </w:r>
+      <w:r>
+        <w:t>.</w:t>
+      </w:r>
+      <w:r>
+        <w:t xml:space="preserve"> Complex amounts will have lower values to denote scarcity. *Note – the number of each resource active in a game will be determined by the number of players.</w:t>
+      </w:r>
+    </w:p>
+    <w:p>
+      <w:pPr>
+        <w:pStyle w:val="ListParagraph"/>
+        <w:numPr>
+          <w:ilvl w:val="0"/>
+          <w:numId w:val="1"/>
+        </w:numPr>
+      </w:pPr>
+      <w:r>
+        <w:rPr>
+          <w:b/>
+          <w:bCs/>
+        </w:rPr>
+        <w:t>Example</w:t>
+      </w:r>
+      <w:r>
+        <w:t>:</w:t>
+      </w:r>
+      <w:r>
+        <w:t xml:space="preserve"> </w:t>
       </w:r>
     </w:p>
     <w:p>
@@ -377,14 +439,60 @@
           <w:b/>
           <w:bCs/>
         </w:rPr>
-        <w:lastRenderedPageBreak/>
         <w:t xml:space="preserve">Helium </w:t>
       </w:r>
       <w:r>
-        <w:t>will have token with face values ranging from 10 – 500 and have a higher number of tokens than other resources.</w:t>
-      </w:r>
-    </w:p>
-    <w:p/>
+        <w:t xml:space="preserve">and </w:t>
+      </w:r>
+      <w:r>
+        <w:rPr>
+          <w:b/>
+          <w:bCs/>
+        </w:rPr>
+        <w:t xml:space="preserve">Tritium </w:t>
+      </w:r>
+      <w:r>
+        <w:t>will have token with face values ranging from 10 – 500</w:t>
+      </w:r>
+      <w:r>
+        <w:t>.</w:t>
+      </w:r>
+    </w:p>
+    <w:p>
+      <w:pPr>
+        <w:pStyle w:val="ListParagraph"/>
+        <w:numPr>
+          <w:ilvl w:val="1"/>
+          <w:numId w:val="1"/>
+        </w:numPr>
+      </w:pPr>
+      <w:r>
+        <w:rPr>
+          <w:b/>
+          <w:bCs/>
+        </w:rPr>
+        <w:t xml:space="preserve">Hydrogen </w:t>
+      </w:r>
+      <w:r>
+        <w:t xml:space="preserve">and </w:t>
+      </w:r>
+      <w:r>
+        <w:rPr>
+          <w:b/>
+          <w:bCs/>
+        </w:rPr>
+        <w:t xml:space="preserve">Ammonia </w:t>
+      </w:r>
+      <w:r>
+        <w:t>will have tokens with face values ranging from 1-100.</w:t>
+      </w:r>
+    </w:p>
+    <w:p>
+      <w:pPr>
+        <w:pStyle w:val="ListParagraph"/>
+        <w:ind w:left="1440"/>
+      </w:pPr>
+    </w:p>
     <w:p>
       <w:pPr>
         <w:pStyle w:val="ListParagraph"/>
@@ -573,7 +681,13 @@
         <w:t xml:space="preserve">– </w:t>
       </w:r>
       <w:r>
-        <w:t>Each player takes a Phase Card and moves the stated number of elements to the Interstellar Medium. This quanity may be modified by the Player Character card.</w:t>
+        <w:t>Each player takes a Phase Card and moves the stated number of elements to the Interstellar Medium. This quan</w:t>
+      </w:r>
+      <w:r>
+        <w:t>t</w:t>
+      </w:r>
+      <w:r>
+        <w:t>ity may be modified by the Player Character card.</w:t>
       </w:r>
     </w:p>
     <w:p>
@@ -686,6 +800,35 @@
         <w:t xml:space="preserve"> way to produce new elements.</w:t>
       </w:r>
     </w:p>
+    <w:p>
+      <w:pPr>
+        <w:pStyle w:val="ListParagraph"/>
+        <w:numPr>
+          <w:ilvl w:val="0"/>
+          <w:numId w:val="2"/>
+        </w:numPr>
+        <w:rPr>
+          <w:b/>
+          <w:bCs/>
+        </w:rPr>
+      </w:pPr>
+      <w:r>
+        <w:rPr>
+          <w:b/>
+          <w:bCs/>
+        </w:rPr>
+        <w:t xml:space="preserve">Time Travel – </w:t>
+      </w:r>
+      <w:r>
+        <w:t xml:space="preserve">Each player’s ship has the ability to </w:t>
+      </w:r>
+      <w:r>
+        <w:t xml:space="preserve">move through time, but it needs to be powered by increasingly complex elements. </w:t>
+      </w:r>
+      <w:r>
+        <w:t xml:space="preserve">This option will only become available once the primary goal of each phase has been achieved. </w:t>
+      </w:r>
+    </w:p>
     <w:p/>
     <w:p>
       <w:pPr>
@@ -782,6 +925,7 @@
         </w:numPr>
       </w:pPr>
       <w:r>
+        <w:lastRenderedPageBreak/>
         <w:t>An image representing the agenda.</w:t>
       </w:r>
     </w:p>
@@ -794,10 +938,13 @@
         </w:numPr>
       </w:pPr>
       <w:r>
-        <w:t>The agenda itself (</w:t>
-      </w:r>
-      <w:r>
-        <w:t>Collect X amount of X – These will be a mixture of common and rare materials in order to give the players the opportunity to start fulfilling their agenda early on in the game).</w:t>
+        <w:t>The agenda (</w:t>
+      </w:r>
+      <w:r>
+        <w:t>C</w:t>
+      </w:r>
+      <w:r>
+        <w:t>ollect X amount of X – These will be a mixture of common and rare materials in order to give the players the opportunity to start fulfilling their agenda early on in the game).</w:t>
       </w:r>
     </w:p>
     <w:p>
@@ -809,8 +956,13 @@
         </w:numPr>
       </w:pPr>
       <w:r>
-        <w:lastRenderedPageBreak/>
-        <w:t>The number of points awarded on succesful completion of the agenda.</w:t>
+        <w:t>The number of points awarded on succe</w:t>
+      </w:r>
+      <w:r>
+        <w:t>s</w:t>
+      </w:r>
+      <w:r>
+        <w:t>sful completion of the agenda.</w:t>
       </w:r>
     </w:p>
     <w:sectPr>

</xml_diff>

<commit_message>
Added more to LfS doc and amended it from conversations with the team today. I have redesigned the board.
</commit_message>
<xml_diff>
--- a/Life From Space.docx
+++ b/Life From Space.docx
@@ -36,7 +36,13 @@
     </w:p>
     <w:p>
       <w:r>
-        <w:t>It’s two minutes after the Big Bang…</w:t>
+        <w:t xml:space="preserve">It’s </w:t>
+      </w:r>
+      <w:r>
+        <w:t>five</w:t>
+      </w:r>
+      <w:r>
+        <w:t xml:space="preserve"> minutes after the Big Bang…</w:t>
       </w:r>
       <w:r>
         <w:t xml:space="preserve"> </w:t>
@@ -190,10 +196,19 @@
         <w:t xml:space="preserve"> – Depicts Space and has clearly demarked zones for </w:t>
       </w:r>
       <w:r>
-        <w:t>‘The Earth’, ‘The Interstellar Medium’ (Trading Post), ‘The Interstellar Nursery’</w:t>
-      </w:r>
-      <w:r>
-        <w:t>, and ‘Black Hole’.</w:t>
+        <w:t xml:space="preserve">‘The Earth’, ‘The Interstellar Medium’ (Trading Post), </w:t>
+      </w:r>
+      <w:r>
+        <w:t xml:space="preserve">and </w:t>
+      </w:r>
+      <w:r>
+        <w:t>‘The Interstellar Nursery’</w:t>
+      </w:r>
+      <w:r>
+        <w:t xml:space="preserve"> (creation)</w:t>
+      </w:r>
+      <w:r>
+        <w:t>.</w:t>
       </w:r>
     </w:p>
     <w:p>
@@ -240,6 +255,21 @@
       <w:r>
         <w:t>– A covert operation that the player must complete in order to score more points.</w:t>
       </w:r>
+      <w:r>
+        <w:t xml:space="preserve"> These come in three varieties: Hoarder (collect x </w:t>
+      </w:r>
+      <w:r>
+        <w:t>number</w:t>
+      </w:r>
+      <w:r>
+        <w:t xml:space="preserve"> of resources), Creator (Create x rare element), Benefactor (donate x </w:t>
+      </w:r>
+      <w:r>
+        <w:t>number</w:t>
+      </w:r>
+      <w:r>
+        <w:t xml:space="preserve"> of resources to one other player).</w:t>
+      </w:r>
     </w:p>
     <w:p>
       <w:pPr>
@@ -293,15 +323,22 @@
           <w:ilvl w:val="0"/>
           <w:numId w:val="1"/>
         </w:numPr>
-      </w:pPr>
-      <w:r>
-        <w:rPr>
-          <w:b/>
-          <w:bCs/>
+        <w:rPr>
+          <w:strike/>
+        </w:rPr>
+      </w:pPr>
+      <w:r>
+        <w:rPr>
+          <w:b/>
+          <w:bCs/>
+          <w:strike/>
         </w:rPr>
         <w:t xml:space="preserve">4x Earth Stage Cards </w:t>
       </w:r>
       <w:r>
+        <w:rPr>
+          <w:strike/>
+        </w:rPr>
         <w:t>– Cards that represent the Earth in different stages, from molten lifeless rock to verdant home to burgeoning life.</w:t>
       </w:r>
     </w:p>
@@ -321,7 +358,19 @@
         <w:t xml:space="preserve">Phase Cards </w:t>
       </w:r>
       <w:r>
-        <w:t>– Used to inform the player as to what quantities of material need to go into the Interstellar Medium from the Big Bang.</w:t>
+        <w:t xml:space="preserve">– Used to inform the player as to what quantities </w:t>
+      </w:r>
+      <w:r>
+        <w:t xml:space="preserve">can be harvested </w:t>
+      </w:r>
+      <w:r>
+        <w:t>from the Big Bang.</w:t>
+      </w:r>
+      <w:r>
+        <w:t xml:space="preserve"> These will be a random selection made by the player during their first turn. These will be early-game resource (not too complex)</w:t>
+      </w:r>
+      <w:r>
+        <w:t>, but there is a chance that the player may get an advantage with a rare resource from the Planetary Nebula phase.</w:t>
       </w:r>
     </w:p>
     <w:p>
@@ -337,10 +386,20 @@
           <w:b/>
           <w:bCs/>
         </w:rPr>
-        <w:t xml:space="preserve">Shockwave Cards </w:t>
-      </w:r>
-      <w:r>
-        <w:t>– A random boon or penalty applied to the elements on the board. This may involve removal of elements (penalty), or the creation of new or rare elements (boon).</w:t>
+        <w:t>Action</w:t>
+      </w:r>
+      <w:r>
+        <w:rPr>
+          <w:b/>
+          <w:bCs/>
+        </w:rPr>
+        <w:t xml:space="preserve"> Cards </w:t>
+      </w:r>
+      <w:r>
+        <w:t>– A random boon or penalty applied to the elements on the board. This may involve removal of elements (penalty), the creation of new or rare elements (boon)</w:t>
+      </w:r>
+      <w:r>
+        <w:t>, or a benevolent action towards other players.</w:t>
       </w:r>
     </w:p>
     <w:p>
@@ -356,6 +415,7 @@
           <w:b/>
           <w:bCs/>
         </w:rPr>
+        <w:lastRenderedPageBreak/>
         <w:t xml:space="preserve">Molecule Cards </w:t>
       </w:r>
       <w:r>
@@ -391,18 +451,131 @@
         <w:t>The less complex, more abundant resources will have tokens with higher amounts</w:t>
       </w:r>
       <w:r>
+        <w:t xml:space="preserve"> available</w:t>
+      </w:r>
+      <w:r>
+        <w:t>.</w:t>
+      </w:r>
+      <w:r>
+        <w:t xml:space="preserve"> Complex amounts will have lower values to denote scarcity. *Note – the number of each resource active in a game will be determined by the number of players.</w:t>
+      </w:r>
+    </w:p>
+    <w:p>
+      <w:pPr>
+        <w:pStyle w:val="ListParagraph"/>
+        <w:numPr>
+          <w:ilvl w:val="1"/>
+          <w:numId w:val="1"/>
+        </w:numPr>
+      </w:pPr>
+      <w:r>
+        <w:rPr>
+          <w:b/>
+          <w:bCs/>
+        </w:rPr>
+        <w:t>Example</w:t>
+      </w:r>
+      <w:r>
+        <w:t>:</w:t>
+      </w:r>
+      <w:r>
         <w:t xml:space="preserve"> </w:t>
       </w:r>
-      <w:r>
-        <w:lastRenderedPageBreak/>
-        <w:t>available</w:t>
+    </w:p>
+    <w:p>
+      <w:pPr>
+        <w:pStyle w:val="ListParagraph"/>
+        <w:numPr>
+          <w:ilvl w:val="2"/>
+          <w:numId w:val="1"/>
+        </w:numPr>
+      </w:pPr>
+      <w:r>
+        <w:rPr>
+          <w:b/>
+          <w:bCs/>
+        </w:rPr>
+        <w:t>Hydrogen</w:t>
+      </w:r>
+      <w:r>
+        <w:rPr>
+          <w:b/>
+          <w:bCs/>
+        </w:rPr>
+        <w:t xml:space="preserve"> </w:t>
+      </w:r>
+      <w:r>
+        <w:t xml:space="preserve">and </w:t>
+      </w:r>
+      <w:r>
+        <w:rPr>
+          <w:b/>
+          <w:bCs/>
+        </w:rPr>
+        <w:t xml:space="preserve">Tritium </w:t>
+      </w:r>
+      <w:r>
+        <w:t>token</w:t>
+      </w:r>
+      <w:r>
+        <w:t>s</w:t>
+      </w:r>
+      <w:r>
+        <w:t xml:space="preserve"> </w:t>
+      </w:r>
+      <w:r>
+        <w:t>will have</w:t>
+      </w:r>
+      <w:r>
+        <w:t xml:space="preserve"> face values from 10 – 500</w:t>
       </w:r>
       <w:r>
         <w:t>.</w:t>
       </w:r>
-      <w:r>
-        <w:t xml:space="preserve"> Complex amounts will have lower values to denote scarcity. *Note – the number of each resource active in a game will be determined by the number of players.</w:t>
-      </w:r>
+    </w:p>
+    <w:p>
+      <w:pPr>
+        <w:pStyle w:val="ListParagraph"/>
+        <w:numPr>
+          <w:ilvl w:val="2"/>
+          <w:numId w:val="1"/>
+        </w:numPr>
+      </w:pPr>
+      <w:r>
+        <w:rPr>
+          <w:b/>
+          <w:bCs/>
+        </w:rPr>
+        <w:t>Helium</w:t>
+      </w:r>
+      <w:r>
+        <w:rPr>
+          <w:b/>
+          <w:bCs/>
+        </w:rPr>
+        <w:t xml:space="preserve"> </w:t>
+      </w:r>
+      <w:r>
+        <w:t>will have tokens with face values ranging from 1</w:t>
+      </w:r>
+      <w:r>
+        <w:t xml:space="preserve"> </w:t>
+      </w:r>
+      <w:r>
+        <w:t>-</w:t>
+      </w:r>
+      <w:r>
+        <w:t xml:space="preserve"> 50</w:t>
+      </w:r>
+      <w:r>
+        <w:t>.</w:t>
+      </w:r>
+    </w:p>
+    <w:p>
+      <w:pPr>
+        <w:pStyle w:val="ListParagraph"/>
+        <w:ind w:left="2160"/>
+      </w:pPr>
     </w:p>
     <w:p>
       <w:pPr>
@@ -417,74 +590,31 @@
           <w:b/>
           <w:bCs/>
         </w:rPr>
-        <w:t>Example</w:t>
-      </w:r>
-      <w:r>
-        <w:t>:</w:t>
-      </w:r>
-      <w:r>
-        <w:t xml:space="preserve"> </w:t>
-      </w:r>
-    </w:p>
-    <w:p>
-      <w:pPr>
-        <w:pStyle w:val="ListParagraph"/>
-        <w:numPr>
-          <w:ilvl w:val="1"/>
-          <w:numId w:val="1"/>
-        </w:numPr>
-      </w:pPr>
-      <w:r>
-        <w:rPr>
-          <w:b/>
-          <w:bCs/>
-        </w:rPr>
-        <w:t xml:space="preserve">Helium </w:t>
-      </w:r>
-      <w:r>
-        <w:t xml:space="preserve">and </w:t>
-      </w:r>
-      <w:r>
-        <w:rPr>
-          <w:b/>
-          <w:bCs/>
-        </w:rPr>
-        <w:t xml:space="preserve">Tritium </w:t>
-      </w:r>
-      <w:r>
-        <w:t>will have token with face values ranging from 10 – 500</w:t>
-      </w:r>
-      <w:r>
-        <w:t>.</w:t>
-      </w:r>
-    </w:p>
-    <w:p>
-      <w:pPr>
-        <w:pStyle w:val="ListParagraph"/>
-        <w:numPr>
-          <w:ilvl w:val="1"/>
-          <w:numId w:val="1"/>
-        </w:numPr>
-      </w:pPr>
-      <w:r>
-        <w:rPr>
-          <w:b/>
-          <w:bCs/>
-        </w:rPr>
-        <w:t xml:space="preserve">Hydrogen </w:t>
-      </w:r>
-      <w:r>
-        <w:t xml:space="preserve">and </w:t>
-      </w:r>
-      <w:r>
-        <w:rPr>
-          <w:b/>
-          <w:bCs/>
-        </w:rPr>
-        <w:t xml:space="preserve">Ammonia </w:t>
-      </w:r>
-      <w:r>
-        <w:t>will have tokens with face values ranging from 1-100.</w:t>
+        <w:t xml:space="preserve">Complex Resource Cards </w:t>
+      </w:r>
+      <w:r>
+        <w:t>– Once basic atom</w:t>
+      </w:r>
+      <w:r>
+        <w:t xml:space="preserve"> tokens </w:t>
+      </w:r>
+      <w:r>
+        <w:t xml:space="preserve">have been </w:t>
+      </w:r>
+      <w:r>
+        <w:t>collected;</w:t>
+      </w:r>
+      <w:r>
+        <w:t xml:space="preserve"> these can be formed together in the Interstellar </w:t>
+      </w:r>
+      <w:r>
+        <w:t>Nursery to</w:t>
+      </w:r>
+      <w:r>
+        <w:t xml:space="preserve"> create more complex molecular structures needed to advance and ultimately create Life on Earth.</w:t>
+      </w:r>
+      <w:r>
+        <w:t xml:space="preserve"> These tokens will then be discarded in exchange for card of that molecular structure whuch the player will keep until they need to deploy it.</w:t>
       </w:r>
     </w:p>
     <w:p>
@@ -560,7 +690,13 @@
         <w:t xml:space="preserve"> placed on board</w:t>
       </w:r>
       <w:r>
-        <w:t xml:space="preserve"> in the ‘Big Bang’ opening zone. The quantity of each resource will depend on the number of players involved. Refer to the Quick Reference sheet for guidance.</w:t>
+        <w:t xml:space="preserve"> in the ‘</w:t>
+      </w:r>
+      <w:r>
+        <w:t>Planetary Nebula’</w:t>
+      </w:r>
+      <w:r>
+        <w:t xml:space="preserve"> opening zone. The quantity of each resource will depend on the number of players involved. Refer to the Quick Reference sheet for guidance.</w:t>
       </w:r>
     </w:p>
     <w:p>
@@ -681,13 +817,43 @@
         <w:t xml:space="preserve">– </w:t>
       </w:r>
       <w:r>
-        <w:t>Each player takes a Phase Card and moves the stated number of elements to the Interstellar Medium. This quan</w:t>
+        <w:t>Each player</w:t>
+      </w:r>
+      <w:r>
+        <w:t xml:space="preserve"> starts with a set amount of Hydrogen, but then also</w:t>
+      </w:r>
+      <w:r>
+        <w:t xml:space="preserve"> takes a Phase Card and </w:t>
+      </w:r>
+      <w:r>
+        <w:t>collects the quanties of the stated elements</w:t>
+      </w:r>
+      <w:r>
+        <w:t xml:space="preserve"> </w:t>
+      </w:r>
+      <w:r>
+        <w:t>(t</w:t>
+      </w:r>
+      <w:r>
+        <w:t>his quan</w:t>
       </w:r>
       <w:r>
         <w:t>t</w:t>
       </w:r>
       <w:r>
-        <w:t>ity may be modified by the Player Character card.</w:t>
+        <w:t>ity may be</w:t>
+      </w:r>
+      <w:r>
+        <w:t xml:space="preserve"> subject to</w:t>
+      </w:r>
+      <w:r>
+        <w:t xml:space="preserve"> modifie</w:t>
+      </w:r>
+      <w:r>
+        <w:t xml:space="preserve">rs stated on </w:t>
+      </w:r>
+      <w:r>
+        <w:t>the Player Character card.</w:t>
       </w:r>
     </w:p>
     <w:p>
@@ -722,13 +888,22 @@
         <w:t>hydrogen and helium</w:t>
       </w:r>
       <w:r>
-        <w:t xml:space="preserve"> </w:t>
-      </w:r>
-      <w:r>
-        <w:t>from</w:t>
-      </w:r>
-      <w:r>
-        <w:t xml:space="preserve"> the Interstellar Nursery to create The Sun. The resources act as currency and require the players to work together – how much of their bank will they be willing to sacrifice for the communal good?</w:t>
+        <w:t xml:space="preserve"> to create The Sun. The resources act as currency and </w:t>
+      </w:r>
+      <w:r>
+        <w:t xml:space="preserve">may </w:t>
+      </w:r>
+      <w:r>
+        <w:t>require</w:t>
+      </w:r>
+      <w:r>
+        <w:t xml:space="preserve"> collaboration from</w:t>
+      </w:r>
+      <w:r>
+        <w:t xml:space="preserve"> the players</w:t>
+      </w:r>
+      <w:r>
+        <w:t>.</w:t>
       </w:r>
     </w:p>
     <w:p>
@@ -741,12 +916,14 @@
         <w:rPr>
           <w:b/>
           <w:bCs/>
-        </w:rPr>
-      </w:pPr>
-      <w:r>
-        <w:rPr>
-          <w:b/>
-          <w:bCs/>
+          <w:strike/>
+        </w:rPr>
+      </w:pPr>
+      <w:r>
+        <w:rPr>
+          <w:b/>
+          <w:bCs/>
+          <w:strike/>
         </w:rPr>
         <w:t>Shockwave</w:t>
       </w:r>
@@ -754,6 +931,7 @@
         <w:rPr>
           <w:b/>
           <w:bCs/>
+          <w:strike/>
         </w:rPr>
         <w:t xml:space="preserve"> </w:t>
       </w:r>
@@ -761,6 +939,7 @@
         <w:rPr>
           <w:b/>
           <w:bCs/>
+          <w:strike/>
         </w:rPr>
         <w:t xml:space="preserve">Phase </w:t>
       </w:r>
@@ -768,35 +947,58 @@
         <w:rPr>
           <w:b/>
           <w:bCs/>
+          <w:strike/>
         </w:rPr>
         <w:t>–</w:t>
       </w:r>
       <w:r>
+        <w:rPr>
+          <w:strike/>
+        </w:rPr>
         <w:t xml:space="preserve"> This may incur a </w:t>
       </w:r>
       <w:r>
+        <w:rPr>
+          <w:strike/>
+        </w:rPr>
         <w:t xml:space="preserve">random </w:t>
       </w:r>
       <w:r>
+        <w:rPr>
+          <w:strike/>
+        </w:rPr>
         <w:t>penalty</w:t>
       </w:r>
       <w:r>
+        <w:rPr>
+          <w:strike/>
+        </w:rPr>
         <w:t xml:space="preserve">, such as removing a percentage of the lighter elements, or a boon, such as creating rare materials which they can either keep or trade. Each player takes a card from the Shockwave Deck and places it face-up. </w:t>
       </w:r>
       <w:r>
+        <w:rPr>
+          <w:strike/>
+        </w:rPr>
         <w:t>The Player Character card may increase or reduce the effect of the Shockwave Phase.</w:t>
       </w:r>
       <w:r>
+        <w:rPr>
+          <w:strike/>
+        </w:rPr>
         <w:t xml:space="preserve"> The Shockwave Phase is essential for progressing the game, as this is the </w:t>
       </w:r>
       <w:r>
         <w:rPr>
           <w:i/>
           <w:iCs/>
+          <w:strike/>
         </w:rPr>
         <w:t>only</w:t>
       </w:r>
       <w:r>
+        <w:rPr>
+          <w:strike/>
+        </w:rPr>
         <w:t xml:space="preserve"> way to produce new elements.</w:t>
       </w:r>
     </w:p>
@@ -810,26 +1012,141 @@
         <w:rPr>
           <w:b/>
           <w:bCs/>
-        </w:rPr>
-      </w:pPr>
-      <w:r>
-        <w:rPr>
-          <w:b/>
-          <w:bCs/>
+          <w:strike/>
+        </w:rPr>
+      </w:pPr>
+      <w:r>
+        <w:rPr>
+          <w:b/>
+          <w:bCs/>
+          <w:strike/>
         </w:rPr>
         <w:t xml:space="preserve">Time Travel – </w:t>
       </w:r>
       <w:r>
+        <w:rPr>
+          <w:strike/>
+        </w:rPr>
         <w:t xml:space="preserve">Each player’s ship has the ability to </w:t>
       </w:r>
       <w:r>
+        <w:rPr>
+          <w:strike/>
+        </w:rPr>
         <w:t xml:space="preserve">move through time, but it needs to be powered by increasingly complex elements. </w:t>
       </w:r>
       <w:r>
+        <w:rPr>
+          <w:strike/>
+        </w:rPr>
         <w:t xml:space="preserve">This option will only become available once the primary goal of each phase has been achieved. </w:t>
       </w:r>
     </w:p>
-    <w:p/>
+    <w:p>
+      <w:pPr>
+        <w:pStyle w:val="ListParagraph"/>
+        <w:numPr>
+          <w:ilvl w:val="0"/>
+          <w:numId w:val="2"/>
+        </w:numPr>
+        <w:rPr>
+          <w:b/>
+          <w:bCs/>
+        </w:rPr>
+      </w:pPr>
+      <w:r>
+        <w:t>Players will have a choice of action on their turn. They can only perform one action (unless otherwise stated by an Action Card).</w:t>
+      </w:r>
+    </w:p>
+    <w:p>
+      <w:pPr>
+        <w:pStyle w:val="ListParagraph"/>
+        <w:rPr>
+          <w:b/>
+          <w:bCs/>
+        </w:rPr>
+      </w:pPr>
+    </w:p>
+    <w:p>
+      <w:pPr>
+        <w:pStyle w:val="ListParagraph"/>
+        <w:numPr>
+          <w:ilvl w:val="1"/>
+          <w:numId w:val="2"/>
+        </w:numPr>
+        <w:rPr>
+          <w:b/>
+          <w:bCs/>
+        </w:rPr>
+      </w:pPr>
+      <w:r>
+        <w:t xml:space="preserve">Move through Time. The player will </w:t>
+      </w:r>
+      <w:r>
+        <w:t>roll the dice and advance a set number of squares. Advancing through time may grant access to more complex molecules.</w:t>
+      </w:r>
+    </w:p>
+    <w:p>
+      <w:pPr>
+        <w:pStyle w:val="ListParagraph"/>
+        <w:numPr>
+          <w:ilvl w:val="1"/>
+          <w:numId w:val="2"/>
+        </w:numPr>
+        <w:rPr>
+          <w:b/>
+          <w:bCs/>
+        </w:rPr>
+      </w:pPr>
+      <w:r>
+        <w:t>Take an Action Card.</w:t>
+      </w:r>
+    </w:p>
+    <w:p>
+      <w:pPr>
+        <w:pStyle w:val="ListParagraph"/>
+        <w:numPr>
+          <w:ilvl w:val="1"/>
+          <w:numId w:val="2"/>
+        </w:numPr>
+        <w:rPr>
+          <w:b/>
+          <w:bCs/>
+        </w:rPr>
+      </w:pPr>
+      <w:r>
+        <w:lastRenderedPageBreak/>
+        <w:t>Gather a resource.</w:t>
+      </w:r>
+    </w:p>
+    <w:p>
+      <w:pPr>
+        <w:pStyle w:val="ListParagraph"/>
+        <w:numPr>
+          <w:ilvl w:val="1"/>
+          <w:numId w:val="2"/>
+        </w:numPr>
+        <w:rPr>
+          <w:b/>
+          <w:bCs/>
+        </w:rPr>
+      </w:pPr>
+    </w:p>
+    <w:p>
+      <w:r>
+        <w:t>As the player’s sun grows, more elements will become available, but beware a premature supernova.</w:t>
+      </w:r>
+    </w:p>
+    <w:p>
+      <w:r>
+        <w:t>The Interstellar Medium</w:t>
+      </w:r>
+    </w:p>
+    <w:p>
+      <w:r>
+        <w:t xml:space="preserve"> </w:t>
+      </w:r>
+    </w:p>
     <w:p>
       <w:pPr>
         <w:rPr>
@@ -925,7 +1242,6 @@
         </w:numPr>
       </w:pPr>
       <w:r>
-        <w:lastRenderedPageBreak/>
         <w:t>An image representing the agenda.</w:t>
       </w:r>
     </w:p>
@@ -963,6 +1279,188 @@
       </w:r>
       <w:r>
         <w:t>sful completion of the agenda.</w:t>
+      </w:r>
+    </w:p>
+    <w:p/>
+    <w:p>
+      <w:r>
+        <w:rPr>
+          <w:noProof/>
+        </w:rPr>
+        <w:drawing>
+          <wp:inline distT="0" distB="0" distL="0" distR="0" wp14:anchorId="3A3938F2" wp14:editId="36E5E2A7">
+            <wp:extent cx="2794000" cy="2794000"/>
+            <wp:effectExtent l="0" t="0" r="0" b="6350"/>
+            <wp:docPr id="440651287" name="Picture 1"/>
+            <wp:cNvGraphicFramePr>
+              <a:graphicFrameLocks xmlns:a="http://schemas.openxmlformats.org/drawingml/2006/main" noChangeAspect="1"/>
+            </wp:cNvGraphicFramePr>
+            <a:graphic xmlns:a="http://schemas.openxmlformats.org/drawingml/2006/main">
+              <a:graphicData uri="http://schemas.openxmlformats.org/drawingml/2006/picture">
+                <pic:pic xmlns:pic="http://schemas.openxmlformats.org/drawingml/2006/picture">
+                  <pic:nvPicPr>
+                    <pic:cNvPr id="0" name="Picture 1"/>
+                    <pic:cNvPicPr>
+                      <a:picLocks noChangeAspect="1" noChangeArrowheads="1"/>
+                    </pic:cNvPicPr>
+                  </pic:nvPicPr>
+                  <pic:blipFill>
+                    <a:blip r:embed="rId5">
+                      <a:extLst>
+                        <a:ext uri="{28A0092B-C50C-407E-A947-70E740481C1C}">
+                          <a14:useLocalDpi xmlns:a14="http://schemas.microsoft.com/office/drawing/2010/main" val="0"/>
+                        </a:ext>
+                      </a:extLst>
+                    </a:blip>
+                    <a:srcRect/>
+                    <a:stretch>
+                      <a:fillRect/>
+                    </a:stretch>
+                  </pic:blipFill>
+                  <pic:spPr bwMode="auto">
+                    <a:xfrm>
+                      <a:off x="0" y="0"/>
+                      <a:ext cx="2794000" cy="2794000"/>
+                    </a:xfrm>
+                    <a:prstGeom prst="rect">
+                      <a:avLst/>
+                    </a:prstGeom>
+                    <a:noFill/>
+                    <a:ln>
+                      <a:noFill/>
+                    </a:ln>
+                  </pic:spPr>
+                </pic:pic>
+              </a:graphicData>
+            </a:graphic>
+          </wp:inline>
+        </w:drawing>
+      </w:r>
+      <w:r>
+        <w:rPr>
+          <w:noProof/>
+        </w:rPr>
+        <w:drawing>
+          <wp:inline distT="0" distB="0" distL="0" distR="0" wp14:anchorId="036D01BF" wp14:editId="72CE1EBD">
+            <wp:extent cx="2787650" cy="2787650"/>
+            <wp:effectExtent l="0" t="0" r="0" b="0"/>
+            <wp:docPr id="1409930833" name="Picture 3"/>
+            <wp:cNvGraphicFramePr>
+              <a:graphicFrameLocks xmlns:a="http://schemas.openxmlformats.org/drawingml/2006/main" noChangeAspect="1"/>
+            </wp:cNvGraphicFramePr>
+            <a:graphic xmlns:a="http://schemas.openxmlformats.org/drawingml/2006/main">
+              <a:graphicData uri="http://schemas.openxmlformats.org/drawingml/2006/picture">
+                <pic:pic xmlns:pic="http://schemas.openxmlformats.org/drawingml/2006/picture">
+                  <pic:nvPicPr>
+                    <pic:cNvPr id="0" name="Picture 3"/>
+                    <pic:cNvPicPr>
+                      <a:picLocks noChangeAspect="1" noChangeArrowheads="1"/>
+                    </pic:cNvPicPr>
+                  </pic:nvPicPr>
+                  <pic:blipFill>
+                    <a:blip r:embed="rId6">
+                      <a:extLst>
+                        <a:ext uri="{28A0092B-C50C-407E-A947-70E740481C1C}">
+                          <a14:useLocalDpi xmlns:a14="http://schemas.microsoft.com/office/drawing/2010/main" val="0"/>
+                        </a:ext>
+                      </a:extLst>
+                    </a:blip>
+                    <a:srcRect/>
+                    <a:stretch>
+                      <a:fillRect/>
+                    </a:stretch>
+                  </pic:blipFill>
+                  <pic:spPr bwMode="auto">
+                    <a:xfrm>
+                      <a:off x="0" y="0"/>
+                      <a:ext cx="2787650" cy="2787650"/>
+                    </a:xfrm>
+                    <a:prstGeom prst="rect">
+                      <a:avLst/>
+                    </a:prstGeom>
+                    <a:noFill/>
+                    <a:ln>
+                      <a:noFill/>
+                    </a:ln>
+                  </pic:spPr>
+                </pic:pic>
+              </a:graphicData>
+            </a:graphic>
+          </wp:inline>
+        </w:drawing>
+      </w:r>
+    </w:p>
+    <w:p>
+      <w:pPr>
+        <w:rPr>
+          <w:noProof/>
+        </w:rPr>
+      </w:pPr>
+    </w:p>
+    <w:p>
+      <w:r>
+        <w:rPr>
+          <w:noProof/>
+        </w:rPr>
+        <w:lastRenderedPageBreak/>
+        <w:drawing>
+          <wp:inline distT="0" distB="0" distL="0" distR="0" wp14:anchorId="74B83B29" wp14:editId="1ACE2D31">
+            <wp:extent cx="3217679" cy="3225800"/>
+            <wp:effectExtent l="0" t="0" r="1905" b="0"/>
+            <wp:docPr id="1481607375" name="Picture 6"/>
+            <wp:cNvGraphicFramePr>
+              <a:graphicFrameLocks xmlns:a="http://schemas.openxmlformats.org/drawingml/2006/main" noChangeAspect="1"/>
+            </wp:cNvGraphicFramePr>
+            <a:graphic xmlns:a="http://schemas.openxmlformats.org/drawingml/2006/main">
+              <a:graphicData uri="http://schemas.openxmlformats.org/drawingml/2006/picture">
+                <pic:pic xmlns:pic="http://schemas.openxmlformats.org/drawingml/2006/picture">
+                  <pic:nvPicPr>
+                    <pic:cNvPr id="1481607375" name="Picture 6"/>
+                    <pic:cNvPicPr>
+                      <a:picLocks noChangeAspect="1" noChangeArrowheads="1"/>
+                    </pic:cNvPicPr>
+                  </pic:nvPicPr>
+                  <pic:blipFill>
+                    <a:blip r:embed="rId7" cstate="print">
+                      <a:extLst>
+                        <a:ext uri="{28A0092B-C50C-407E-A947-70E740481C1C}">
+                          <a14:useLocalDpi xmlns:a14="http://schemas.microsoft.com/office/drawing/2010/main" val="0"/>
+                        </a:ext>
+                      </a:extLst>
+                    </a:blip>
+                    <a:stretch>
+                      <a:fillRect/>
+                    </a:stretch>
+                  </pic:blipFill>
+                  <pic:spPr bwMode="auto">
+                    <a:xfrm>
+                      <a:off x="0" y="0"/>
+                      <a:ext cx="3217679" cy="3225800"/>
+                    </a:xfrm>
+                    <a:prstGeom prst="rect">
+                      <a:avLst/>
+                    </a:prstGeom>
+                    <a:noFill/>
+                    <a:ln>
+                      <a:noFill/>
+                    </a:ln>
+                  </pic:spPr>
+                </pic:pic>
+              </a:graphicData>
+            </a:graphic>
+          </wp:inline>
+        </w:drawing>
+      </w:r>
+    </w:p>
+    <w:p>
+      <w:r>
+        <w:t xml:space="preserve">Revised board shows the Big Bang on the left leading into the Planetary Nebula, where more complex materials need to be gathered while your sun grows. Upon a successful supernova event, the player is able to transition to the Interstellar </w:t>
+      </w:r>
+      <w:r>
+        <w:t>Medium</w:t>
+      </w:r>
+      <w:r>
+        <w:t xml:space="preserve"> phase. </w:t>
       </w:r>
     </w:p>
     <w:sectPr>
@@ -1206,7 +1704,7 @@
   <w:abstractNum w:abstractNumId="2" w15:restartNumberingAfterBreak="0">
     <w:nsid w:val="57615EDF"/>
     <w:multiLevelType w:val="hybridMultilevel"/>
-    <w:tmpl w:val="A19E9CE8"/>
+    <w:tmpl w:val="2E4EC65C"/>
     <w:lvl w:ilvl="0" w:tplc="08090001">
       <w:start w:val="1"/>
       <w:numFmt w:val="bullet"/>

</xml_diff>

<commit_message>
Added a lot of changed - Working on v3 of the board. Have created a template for the Interstellar Nursery. Working on documentation.
</commit_message>
<xml_diff>
--- a/Life From Space.docx
+++ b/Life From Space.docx
@@ -65,7 +65,13 @@
         <w:t>reate life from the</w:t>
       </w:r>
       <w:r>
-        <w:t xml:space="preserve"> dense and ever-evolving matter around them</w:t>
+        <w:t xml:space="preserve"> </w:t>
+      </w:r>
+      <w:r>
+        <w:t>choas</w:t>
+      </w:r>
+      <w:r>
+        <w:t xml:space="preserve"> around them</w:t>
       </w:r>
       <w:r>
         <w:t>.</w:t>
@@ -150,7 +156,15 @@
       </w:r>
     </w:p>
     <w:p>
-      <w:r>
+      <w:pPr>
+        <w:rPr>
+          <w:strike/>
+        </w:rPr>
+      </w:pPr>
+      <w:r>
+        <w:rPr>
+          <w:strike/>
+        </w:rPr>
         <w:t>Scoring takes place at the end of the game, with a single winner being declared.</w:t>
       </w:r>
     </w:p>
@@ -218,11 +232,15 @@
           <w:ilvl w:val="0"/>
           <w:numId w:val="1"/>
         </w:numPr>
-      </w:pPr>
-      <w:r>
-        <w:rPr>
-          <w:b/>
-          <w:bCs/>
+        <w:rPr>
+          <w:color w:val="FF0000"/>
+        </w:rPr>
+      </w:pPr>
+      <w:r>
+        <w:rPr>
+          <w:b/>
+          <w:bCs/>
+          <w:color w:val="FF0000"/>
         </w:rPr>
         <w:t xml:space="preserve">8x </w:t>
       </w:r>
@@ -230,10 +248,14 @@
         <w:rPr>
           <w:b/>
           <w:bCs/>
+          <w:color w:val="FF0000"/>
         </w:rPr>
         <w:t>Player Character Cards</w:t>
       </w:r>
       <w:r>
+        <w:rPr>
+          <w:color w:val="FF0000"/>
+        </w:rPr>
         <w:t xml:space="preserve"> – Distinct personalities with a secret mission which earns more points if completed.</w:t>
       </w:r>
     </w:p>
@@ -244,30 +266,52 @@
           <w:ilvl w:val="0"/>
           <w:numId w:val="1"/>
         </w:numPr>
-      </w:pPr>
-      <w:r>
-        <w:rPr>
-          <w:b/>
-          <w:bCs/>
+        <w:rPr>
+          <w:color w:val="FF0000"/>
+        </w:rPr>
+      </w:pPr>
+      <w:r>
+        <w:rPr>
+          <w:b/>
+          <w:bCs/>
+          <w:color w:val="FF0000"/>
         </w:rPr>
         <w:t xml:space="preserve">Secret Agenda Cards </w:t>
       </w:r>
       <w:r>
+        <w:rPr>
+          <w:color w:val="FF0000"/>
+        </w:rPr>
         <w:t>– A covert operation that the player must complete in order to score more points.</w:t>
       </w:r>
       <w:r>
+        <w:rPr>
+          <w:color w:val="FF0000"/>
+        </w:rPr>
         <w:t xml:space="preserve"> These come in three varieties: Hoarder (collect x </w:t>
       </w:r>
       <w:r>
+        <w:rPr>
+          <w:color w:val="FF0000"/>
+        </w:rPr>
         <w:t>number</w:t>
       </w:r>
       <w:r>
+        <w:rPr>
+          <w:color w:val="FF0000"/>
+        </w:rPr>
         <w:t xml:space="preserve"> of resources), Creator (Create x rare element), Benefactor (donate x </w:t>
       </w:r>
       <w:r>
+        <w:rPr>
+          <w:color w:val="FF0000"/>
+        </w:rPr>
         <w:t>number</w:t>
       </w:r>
       <w:r>
+        <w:rPr>
+          <w:color w:val="FF0000"/>
+        </w:rPr>
         <w:t xml:space="preserve"> of resources to one other player).</w:t>
       </w:r>
     </w:p>
@@ -310,10 +354,36 @@
           <w:b/>
           <w:bCs/>
         </w:rPr>
-        <w:t>6x Player trays</w:t>
-      </w:r>
-      <w:r>
-        <w:t>. Can be placed on the board as a space for the players to build their cosmic matter. Modular in nature in order to accommodate varying numbers of players.</w:t>
+        <w:t xml:space="preserve">6x </w:t>
+      </w:r>
+      <w:r>
+        <w:rPr>
+          <w:b/>
+          <w:bCs/>
+        </w:rPr>
+        <w:t xml:space="preserve">Interstellar Nursery </w:t>
+      </w:r>
+      <w:r>
+        <w:rPr>
+          <w:b/>
+          <w:bCs/>
+        </w:rPr>
+        <w:t>Player trays</w:t>
+      </w:r>
+      <w:r>
+        <w:t xml:space="preserve">. </w:t>
+      </w:r>
+      <w:r>
+        <w:t>A protected</w:t>
+      </w:r>
+      <w:r>
+        <w:t xml:space="preserve"> space for the players to build their </w:t>
+      </w:r>
+      <w:r>
+        <w:t>simple molecules</w:t>
+      </w:r>
+      <w:r>
+        <w:t>.</w:t>
       </w:r>
     </w:p>
     <w:p>
@@ -355,22 +425,44 @@
           <w:b/>
           <w:bCs/>
         </w:rPr>
-        <w:t xml:space="preserve">Phase Cards </w:t>
-      </w:r>
-      <w:r>
-        <w:t xml:space="preserve">– Used to inform the player as to what quantities </w:t>
-      </w:r>
-      <w:r>
-        <w:t xml:space="preserve">can be harvested </w:t>
-      </w:r>
-      <w:r>
-        <w:t>from the Big Bang.</w:t>
-      </w:r>
-      <w:r>
-        <w:t xml:space="preserve"> These will be a random selection made by the player during their first turn. These will be early-game resource (not too complex)</w:t>
-      </w:r>
-      <w:r>
-        <w:t>, but there is a chance that the player may get an advantage with a rare resource from the Planetary Nebula phase.</w:t>
+        <w:t>Action</w:t>
+      </w:r>
+      <w:r>
+        <w:rPr>
+          <w:b/>
+          <w:bCs/>
+        </w:rPr>
+        <w:t xml:space="preserve"> Cards </w:t>
+      </w:r>
+      <w:r>
+        <w:t>–</w:t>
+      </w:r>
+      <w:r>
+        <w:t xml:space="preserve"> </w:t>
+      </w:r>
+      <w:r>
+        <w:t xml:space="preserve">A random boon or penalty applied to the </w:t>
+      </w:r>
+      <w:r>
+        <w:t xml:space="preserve">player, or to the </w:t>
+      </w:r>
+      <w:r>
+        <w:t>elements on the board. This may involve removal of elements (penalty), the creation of new or rare elements (boon)</w:t>
+      </w:r>
+      <w:r>
+        <w:t>, or a</w:t>
+      </w:r>
+      <w:r>
+        <w:t>n</w:t>
+      </w:r>
+      <w:r>
+        <w:t xml:space="preserve"> action towards</w:t>
+      </w:r>
+      <w:r>
+        <w:t xml:space="preserve"> oneself or</w:t>
+      </w:r>
+      <w:r>
+        <w:t xml:space="preserve"> other players.</w:t>
       </w:r>
     </w:p>
     <w:p>
@@ -386,21 +478,148 @@
           <w:b/>
           <w:bCs/>
         </w:rPr>
-        <w:t>Action</w:t>
-      </w:r>
-      <w:r>
-        <w:rPr>
-          <w:b/>
-          <w:bCs/>
-        </w:rPr>
-        <w:t xml:space="preserve"> Cards </w:t>
-      </w:r>
-      <w:r>
-        <w:t>– A random boon or penalty applied to the elements on the board. This may involve removal of elements (penalty), the creation of new or rare elements (boon)</w:t>
-      </w:r>
-      <w:r>
-        <w:t>, or a benevolent action towards other players.</w:t>
-      </w:r>
+        <w:t xml:space="preserve">Resources </w:t>
+      </w:r>
+      <w:r>
+        <w:rPr>
+          <w:b/>
+          <w:bCs/>
+        </w:rPr>
+        <w:t xml:space="preserve">Tokens </w:t>
+      </w:r>
+      <w:r>
+        <w:t xml:space="preserve">– Hydrogen, Helium, Carbon through to more complex structures. </w:t>
+      </w:r>
+      <w:r>
+        <w:t>The less complex, more abundant resources will have tokens with higher amounts</w:t>
+      </w:r>
+      <w:r>
+        <w:t xml:space="preserve"> available</w:t>
+      </w:r>
+      <w:r>
+        <w:t>.</w:t>
+      </w:r>
+      <w:r>
+        <w:t xml:space="preserve"> Complex amounts will have lower values to denote scarcity. *Note – the number of each resource active in a game will be determined by the number of players.</w:t>
+      </w:r>
+    </w:p>
+    <w:p>
+      <w:pPr>
+        <w:pStyle w:val="ListParagraph"/>
+        <w:numPr>
+          <w:ilvl w:val="1"/>
+          <w:numId w:val="1"/>
+        </w:numPr>
+      </w:pPr>
+      <w:r>
+        <w:rPr>
+          <w:b/>
+          <w:bCs/>
+        </w:rPr>
+        <w:t>Example</w:t>
+      </w:r>
+      <w:r>
+        <w:t>:</w:t>
+      </w:r>
+      <w:r>
+        <w:t xml:space="preserve"> </w:t>
+      </w:r>
+    </w:p>
+    <w:p>
+      <w:pPr>
+        <w:pStyle w:val="ListParagraph"/>
+        <w:numPr>
+          <w:ilvl w:val="2"/>
+          <w:numId w:val="1"/>
+        </w:numPr>
+      </w:pPr>
+      <w:r>
+        <w:rPr>
+          <w:b/>
+          <w:bCs/>
+        </w:rPr>
+        <w:t>Hydrogen</w:t>
+      </w:r>
+      <w:r>
+        <w:rPr>
+          <w:b/>
+          <w:bCs/>
+        </w:rPr>
+        <w:t xml:space="preserve"> </w:t>
+      </w:r>
+      <w:r>
+        <w:t xml:space="preserve">and </w:t>
+      </w:r>
+      <w:r>
+        <w:rPr>
+          <w:b/>
+          <w:bCs/>
+        </w:rPr>
+        <w:t xml:space="preserve">Tritium </w:t>
+      </w:r>
+      <w:r>
+        <w:t>token</w:t>
+      </w:r>
+      <w:r>
+        <w:t>s</w:t>
+      </w:r>
+      <w:r>
+        <w:t xml:space="preserve"> </w:t>
+      </w:r>
+      <w:r>
+        <w:t>will have</w:t>
+      </w:r>
+      <w:r>
+        <w:t xml:space="preserve"> face values from 10 – 500</w:t>
+      </w:r>
+      <w:r>
+        <w:t>.</w:t>
+      </w:r>
+    </w:p>
+    <w:p>
+      <w:pPr>
+        <w:pStyle w:val="ListParagraph"/>
+        <w:numPr>
+          <w:ilvl w:val="2"/>
+          <w:numId w:val="1"/>
+        </w:numPr>
+      </w:pPr>
+      <w:r>
+        <w:rPr>
+          <w:b/>
+          <w:bCs/>
+        </w:rPr>
+        <w:lastRenderedPageBreak/>
+        <w:t>Helium</w:t>
+      </w:r>
+      <w:r>
+        <w:rPr>
+          <w:b/>
+          <w:bCs/>
+        </w:rPr>
+        <w:t xml:space="preserve"> </w:t>
+      </w:r>
+      <w:r>
+        <w:t>will have tokens with face values ranging from 1</w:t>
+      </w:r>
+      <w:r>
+        <w:t xml:space="preserve"> </w:t>
+      </w:r>
+      <w:r>
+        <w:t>-</w:t>
+      </w:r>
+      <w:r>
+        <w:t xml:space="preserve"> 50</w:t>
+      </w:r>
+      <w:r>
+        <w:t>.</w:t>
+      </w:r>
+    </w:p>
+    <w:p>
+      <w:pPr>
+        <w:pStyle w:val="ListParagraph"/>
+        <w:ind w:left="2160"/>
+      </w:pPr>
     </w:p>
     <w:p>
       <w:pPr>
@@ -415,181 +634,6 @@
           <w:b/>
           <w:bCs/>
         </w:rPr>
-        <w:lastRenderedPageBreak/>
-        <w:t xml:space="preserve">Molecule Cards </w:t>
-      </w:r>
-      <w:r>
-        <w:t>– These are complex structures that require building before they can be deployed. Each molecule displays the element and the number of that element needed before it can be completed.</w:t>
-      </w:r>
-    </w:p>
-    <w:p>
-      <w:pPr>
-        <w:pStyle w:val="ListParagraph"/>
-        <w:numPr>
-          <w:ilvl w:val="0"/>
-          <w:numId w:val="1"/>
-        </w:numPr>
-      </w:pPr>
-      <w:r>
-        <w:rPr>
-          <w:b/>
-          <w:bCs/>
-        </w:rPr>
-        <w:t xml:space="preserve">Resources </w:t>
-      </w:r>
-      <w:r>
-        <w:rPr>
-          <w:b/>
-          <w:bCs/>
-        </w:rPr>
-        <w:t xml:space="preserve">Tokens </w:t>
-      </w:r>
-      <w:r>
-        <w:t xml:space="preserve">– Hydrogen, Helium, Carbon through to more complex structures. </w:t>
-      </w:r>
-      <w:r>
-        <w:t>The less complex, more abundant resources will have tokens with higher amounts</w:t>
-      </w:r>
-      <w:r>
-        <w:t xml:space="preserve"> available</w:t>
-      </w:r>
-      <w:r>
-        <w:t>.</w:t>
-      </w:r>
-      <w:r>
-        <w:t xml:space="preserve"> Complex amounts will have lower values to denote scarcity. *Note – the number of each resource active in a game will be determined by the number of players.</w:t>
-      </w:r>
-    </w:p>
-    <w:p>
-      <w:pPr>
-        <w:pStyle w:val="ListParagraph"/>
-        <w:numPr>
-          <w:ilvl w:val="1"/>
-          <w:numId w:val="1"/>
-        </w:numPr>
-      </w:pPr>
-      <w:r>
-        <w:rPr>
-          <w:b/>
-          <w:bCs/>
-        </w:rPr>
-        <w:t>Example</w:t>
-      </w:r>
-      <w:r>
-        <w:t>:</w:t>
-      </w:r>
-      <w:r>
-        <w:t xml:space="preserve"> </w:t>
-      </w:r>
-    </w:p>
-    <w:p>
-      <w:pPr>
-        <w:pStyle w:val="ListParagraph"/>
-        <w:numPr>
-          <w:ilvl w:val="2"/>
-          <w:numId w:val="1"/>
-        </w:numPr>
-      </w:pPr>
-      <w:r>
-        <w:rPr>
-          <w:b/>
-          <w:bCs/>
-        </w:rPr>
-        <w:t>Hydrogen</w:t>
-      </w:r>
-      <w:r>
-        <w:rPr>
-          <w:b/>
-          <w:bCs/>
-        </w:rPr>
-        <w:t xml:space="preserve"> </w:t>
-      </w:r>
-      <w:r>
-        <w:t xml:space="preserve">and </w:t>
-      </w:r>
-      <w:r>
-        <w:rPr>
-          <w:b/>
-          <w:bCs/>
-        </w:rPr>
-        <w:t xml:space="preserve">Tritium </w:t>
-      </w:r>
-      <w:r>
-        <w:t>token</w:t>
-      </w:r>
-      <w:r>
-        <w:t>s</w:t>
-      </w:r>
-      <w:r>
-        <w:t xml:space="preserve"> </w:t>
-      </w:r>
-      <w:r>
-        <w:t>will have</w:t>
-      </w:r>
-      <w:r>
-        <w:t xml:space="preserve"> face values from 10 – 500</w:t>
-      </w:r>
-      <w:r>
-        <w:t>.</w:t>
-      </w:r>
-    </w:p>
-    <w:p>
-      <w:pPr>
-        <w:pStyle w:val="ListParagraph"/>
-        <w:numPr>
-          <w:ilvl w:val="2"/>
-          <w:numId w:val="1"/>
-        </w:numPr>
-      </w:pPr>
-      <w:r>
-        <w:rPr>
-          <w:b/>
-          <w:bCs/>
-        </w:rPr>
-        <w:t>Helium</w:t>
-      </w:r>
-      <w:r>
-        <w:rPr>
-          <w:b/>
-          <w:bCs/>
-        </w:rPr>
-        <w:t xml:space="preserve"> </w:t>
-      </w:r>
-      <w:r>
-        <w:t>will have tokens with face values ranging from 1</w:t>
-      </w:r>
-      <w:r>
-        <w:t xml:space="preserve"> </w:t>
-      </w:r>
-      <w:r>
-        <w:t>-</w:t>
-      </w:r>
-      <w:r>
-        <w:t xml:space="preserve"> 50</w:t>
-      </w:r>
-      <w:r>
-        <w:t>.</w:t>
-      </w:r>
-    </w:p>
-    <w:p>
-      <w:pPr>
-        <w:pStyle w:val="ListParagraph"/>
-        <w:ind w:left="2160"/>
-      </w:pPr>
-    </w:p>
-    <w:p>
-      <w:pPr>
-        <w:pStyle w:val="ListParagraph"/>
-        <w:numPr>
-          <w:ilvl w:val="0"/>
-          <w:numId w:val="1"/>
-        </w:numPr>
-      </w:pPr>
-      <w:r>
-        <w:rPr>
-          <w:b/>
-          <w:bCs/>
-        </w:rPr>
         <w:t xml:space="preserve">Complex Resource Cards </w:t>
       </w:r>
       <w:r>
@@ -605,10 +649,24 @@
         <w:t>collected;</w:t>
       </w:r>
       <w:r>
-        <w:t xml:space="preserve"> these can be formed together in the Interstellar </w:t>
-      </w:r>
-      <w:r>
-        <w:t>Nursery to</w:t>
+        <w:t xml:space="preserve"> these can be formed together in the </w:t>
+      </w:r>
+      <w:r>
+        <w:rPr>
+          <w:b/>
+          <w:bCs/>
+        </w:rPr>
+        <w:t xml:space="preserve">Interstellar </w:t>
+      </w:r>
+      <w:r>
+        <w:rPr>
+          <w:b/>
+          <w:bCs/>
+        </w:rPr>
+        <w:t>Nursery</w:t>
+      </w:r>
+      <w:r>
+        <w:t xml:space="preserve"> to</w:t>
       </w:r>
       <w:r>
         <w:t xml:space="preserve"> create more complex molecular structures needed to advance and ultimately create Life on Earth.</w:t>
@@ -681,13 +739,7 @@
         <w:t xml:space="preserve"> </w:t>
       </w:r>
       <w:r>
-        <w:t xml:space="preserve">and </w:t>
-      </w:r>
-      <w:r>
-        <w:t>are</w:t>
-      </w:r>
-      <w:r>
-        <w:t xml:space="preserve"> placed on board</w:t>
+        <w:t>are distributed</w:t>
       </w:r>
       <w:r>
         <w:t xml:space="preserve"> in the ‘</w:t>
@@ -709,52 +761,93 @@
         <w:rPr>
           <w:b/>
           <w:bCs/>
-        </w:rPr>
-      </w:pPr>
-      <w:r>
+          <w:color w:val="FF0000"/>
+        </w:rPr>
+      </w:pPr>
+      <w:r>
+        <w:rPr>
+          <w:color w:val="FF0000"/>
+        </w:rPr>
         <w:t>P</w:t>
       </w:r>
       <w:r>
-        <w:t xml:space="preserve">layers select </w:t>
-      </w:r>
-      <w:r>
+        <w:rPr>
+          <w:color w:val="FF0000"/>
+        </w:rPr>
+        <w:t xml:space="preserve">layers </w:t>
+      </w:r>
+      <w:r>
+        <w:rPr>
+          <w:color w:val="FF0000"/>
+        </w:rPr>
         <w:t xml:space="preserve">randomly select </w:t>
       </w:r>
       <w:r>
+        <w:rPr>
+          <w:color w:val="FF0000"/>
+        </w:rPr>
         <w:t xml:space="preserve">their </w:t>
       </w:r>
       <w:r>
+        <w:rPr>
+          <w:color w:val="FF0000"/>
+        </w:rPr>
         <w:t>C</w:t>
       </w:r>
       <w:r>
+        <w:rPr>
+          <w:color w:val="FF0000"/>
+        </w:rPr>
         <w:t>haracter cards</w:t>
       </w:r>
       <w:r>
+        <w:rPr>
+          <w:color w:val="FF0000"/>
+        </w:rPr>
         <w:t xml:space="preserve"> and one Secret Agenda card</w:t>
       </w:r>
       <w:r>
+        <w:rPr>
+          <w:color w:val="FF0000"/>
+        </w:rPr>
         <w:t xml:space="preserve">. </w:t>
       </w:r>
       <w:r>
+        <w:rPr>
+          <w:color w:val="FF0000"/>
+        </w:rPr>
         <w:t>Players</w:t>
       </w:r>
       <w:r>
+        <w:rPr>
+          <w:color w:val="FF0000"/>
+        </w:rPr>
         <w:t xml:space="preserve"> must </w:t>
       </w:r>
       <w:r>
         <w:rPr>
           <w:b/>
           <w:bCs/>
+          <w:color w:val="FF0000"/>
         </w:rPr>
         <w:t>not</w:t>
       </w:r>
       <w:r>
+        <w:rPr>
+          <w:color w:val="FF0000"/>
+        </w:rPr>
         <w:t xml:space="preserve"> reveal their character’s secret </w:t>
       </w:r>
       <w:r>
+        <w:rPr>
+          <w:color w:val="FF0000"/>
+        </w:rPr>
         <w:t>Agenda to any other player</w:t>
       </w:r>
       <w:r>
+        <w:rPr>
+          <w:color w:val="FF0000"/>
+        </w:rPr>
         <w:t xml:space="preserve">. </w:t>
       </w:r>
     </w:p>
@@ -780,12 +873,48 @@
     <w:p>
       <w:pPr>
         <w:pStyle w:val="ListParagraph"/>
-        <w:ind w:left="1440"/>
-        <w:rPr>
-          <w:b/>
-          <w:bCs/>
-        </w:rPr>
-      </w:pPr>
+        <w:numPr>
+          <w:ilvl w:val="1"/>
+          <w:numId w:val="2"/>
+        </w:numPr>
+        <w:rPr>
+          <w:b/>
+          <w:bCs/>
+        </w:rPr>
+      </w:pPr>
+      <w:r>
+        <w:t xml:space="preserve">Each player selects a </w:t>
+      </w:r>
+      <w:r>
+        <w:rPr>
+          <w:b/>
+          <w:bCs/>
+        </w:rPr>
+        <w:t xml:space="preserve">Gate Keeper </w:t>
+      </w:r>
+      <w:r>
+        <w:t xml:space="preserve">card and places it face down on an empty square in the </w:t>
+      </w:r>
+      <w:r>
+        <w:rPr>
+          <w:b/>
+          <w:bCs/>
+        </w:rPr>
+        <w:t xml:space="preserve">Solar System </w:t>
+      </w:r>
+      <w:r>
+        <w:t xml:space="preserve">zone. These cards must remain hidden to all players until at least one player has reached the </w:t>
+      </w:r>
+      <w:r>
+        <w:rPr>
+          <w:b/>
+          <w:bCs/>
+        </w:rPr>
+        <w:t>Solar System</w:t>
+      </w:r>
+      <w:r>
+        <w:t>.</w:t>
+      </w:r>
     </w:p>
     <w:p>
       <w:pPr>
@@ -800,61 +929,130 @@
         </w:rPr>
       </w:pPr>
       <w:r>
-        <w:rPr>
-          <w:b/>
-          <w:bCs/>
-        </w:rPr>
-        <w:t>Distribution of starting resources</w:t>
+        <w:t>Each player in turn chooses from 4 different actions.</w:t>
       </w:r>
       <w:r>
         <w:t xml:space="preserve"> </w:t>
       </w:r>
       <w:r>
-        <w:rPr>
-          <w:b/>
-          <w:bCs/>
-        </w:rPr>
-        <w:t xml:space="preserve">– </w:t>
-      </w:r>
-      <w:r>
-        <w:t>Each player</w:t>
-      </w:r>
-      <w:r>
-        <w:t xml:space="preserve"> starts with a set amount of Hydrogen, but then also</w:t>
-      </w:r>
-      <w:r>
-        <w:t xml:space="preserve"> takes a Phase Card and </w:t>
-      </w:r>
-      <w:r>
-        <w:t>collects the quanties of the stated elements</w:t>
-      </w:r>
-      <w:r>
+        <w:t>They can only perform one action (unless otherwise stated by an Action Card).</w:t>
+      </w:r>
+    </w:p>
+    <w:p>
+      <w:pPr>
+        <w:pStyle w:val="ListParagraph"/>
+        <w:rPr>
+          <w:b/>
+          <w:bCs/>
+        </w:rPr>
+      </w:pPr>
+    </w:p>
+    <w:p>
+      <w:pPr>
+        <w:pStyle w:val="ListParagraph"/>
+        <w:numPr>
+          <w:ilvl w:val="1"/>
+          <w:numId w:val="2"/>
+        </w:numPr>
+        <w:rPr>
+          <w:b/>
+          <w:bCs/>
+          <w:strike/>
+        </w:rPr>
+      </w:pPr>
+      <w:r>
+        <w:t xml:space="preserve">Move through Time. </w:t>
+      </w:r>
+      <w:r>
+        <w:rPr>
+          <w:strike/>
+        </w:rPr>
+        <w:t>The player will roll the dice and advance a set number of squares. Advancing through time may grant access to more complex molecules.</w:t>
+      </w:r>
+      <w:r>
+        <w:rPr>
+          <w:strike/>
+        </w:rPr>
         <w:t xml:space="preserve"> </w:t>
       </w:r>
       <w:r>
-        <w:t>(t</w:t>
-      </w:r>
-      <w:r>
-        <w:t>his quan</w:t>
-      </w:r>
-      <w:r>
-        <w:t>t</w:t>
-      </w:r>
-      <w:r>
-        <w:t>ity may be</w:t>
-      </w:r>
-      <w:r>
-        <w:t xml:space="preserve"> subject to</w:t>
-      </w:r>
-      <w:r>
-        <w:t xml:space="preserve"> modifie</w:t>
-      </w:r>
-      <w:r>
-        <w:t xml:space="preserve">rs stated on </w:t>
-      </w:r>
-      <w:r>
-        <w:t>the Player Character card.</w:t>
-      </w:r>
+        <w:t>The player can move one square back or forth on the board, depending on where they are. One move = one square, unless an Action Card is available that dictates otherwise.</w:t>
+      </w:r>
+    </w:p>
+    <w:p>
+      <w:pPr>
+        <w:pStyle w:val="ListParagraph"/>
+        <w:numPr>
+          <w:ilvl w:val="1"/>
+          <w:numId w:val="2"/>
+        </w:numPr>
+        <w:rPr>
+          <w:b/>
+          <w:bCs/>
+        </w:rPr>
+      </w:pPr>
+      <w:r>
+        <w:t>Take an Action Card.</w:t>
+      </w:r>
+    </w:p>
+    <w:p>
+      <w:pPr>
+        <w:pStyle w:val="ListParagraph"/>
+        <w:numPr>
+          <w:ilvl w:val="1"/>
+          <w:numId w:val="2"/>
+        </w:numPr>
+        <w:rPr>
+          <w:b/>
+          <w:bCs/>
+        </w:rPr>
+      </w:pPr>
+      <w:r>
+        <w:t>Gather a resource.</w:t>
+      </w:r>
+    </w:p>
+    <w:p>
+      <w:pPr>
+        <w:pStyle w:val="ListParagraph"/>
+        <w:numPr>
+          <w:ilvl w:val="1"/>
+          <w:numId w:val="2"/>
+        </w:numPr>
+        <w:rPr>
+          <w:b/>
+          <w:bCs/>
+        </w:rPr>
+      </w:pPr>
+      <w:r>
+        <w:t xml:space="preserve">Use the </w:t>
+      </w:r>
+      <w:r>
+        <w:rPr>
+          <w:b/>
+          <w:bCs/>
+        </w:rPr>
+        <w:t>Interstellar Nursery</w:t>
+      </w:r>
+    </w:p>
+    <w:p>
+      <w:pPr>
+        <w:pStyle w:val="ListParagraph"/>
+        <w:ind w:left="1440"/>
+        <w:rPr>
+          <w:b/>
+          <w:bCs/>
+        </w:rPr>
+      </w:pPr>
+    </w:p>
+    <w:p>
+      <w:pPr>
+        <w:pStyle w:val="ListParagraph"/>
+        <w:ind w:left="1440"/>
+        <w:rPr>
+          <w:b/>
+          <w:bCs/>
+        </w:rPr>
+      </w:pPr>
     </w:p>
     <w:p>
       <w:pPr>
@@ -873,37 +1071,56 @@
           <w:b/>
           <w:bCs/>
         </w:rPr>
-        <w:t>Let there be Light –</w:t>
-      </w:r>
-      <w:r>
-        <w:t xml:space="preserve"> Each player must </w:t>
-      </w:r>
-      <w:r>
-        <w:t>gather</w:t>
+        <w:t>Distribution of starting resources</w:t>
       </w:r>
       <w:r>
         <w:t xml:space="preserve"> </w:t>
       </w:r>
       <w:r>
-        <w:t>hydrogen and helium</w:t>
-      </w:r>
-      <w:r>
-        <w:t xml:space="preserve"> to create The Sun. The resources act as currency and </w:t>
-      </w:r>
-      <w:r>
-        <w:t xml:space="preserve">may </w:t>
-      </w:r>
-      <w:r>
-        <w:t>require</w:t>
-      </w:r>
-      <w:r>
-        <w:t xml:space="preserve"> collaboration from</w:t>
-      </w:r>
-      <w:r>
-        <w:t xml:space="preserve"> the players</w:t>
-      </w:r>
-      <w:r>
-        <w:t>.</w:t>
+        <w:rPr>
+          <w:b/>
+          <w:bCs/>
+        </w:rPr>
+        <w:t xml:space="preserve">– </w:t>
+      </w:r>
+      <w:r>
+        <w:t>Each player</w:t>
+      </w:r>
+      <w:r>
+        <w:t xml:space="preserve"> starts with a set amount of Hydrogen, but then also</w:t>
+      </w:r>
+      <w:r>
+        <w:t xml:space="preserve"> takes a Phase Card and </w:t>
+      </w:r>
+      <w:r>
+        <w:t>collects the quanties of the stated elements</w:t>
+      </w:r>
+      <w:r>
+        <w:t xml:space="preserve"> </w:t>
+      </w:r>
+      <w:r>
+        <w:t>(t</w:t>
+      </w:r>
+      <w:r>
+        <w:t>his quan</w:t>
+      </w:r>
+      <w:r>
+        <w:t>t</w:t>
+      </w:r>
+      <w:r>
+        <w:t>ity may be</w:t>
+      </w:r>
+      <w:r>
+        <w:t xml:space="preserve"> subject to</w:t>
+      </w:r>
+      <w:r>
+        <w:t xml:space="preserve"> modifie</w:t>
+      </w:r>
+      <w:r>
+        <w:t xml:space="preserve">rs stated on </w:t>
+      </w:r>
+      <w:r>
+        <w:t>the Player Character card.</w:t>
       </w:r>
     </w:p>
     <w:p>
@@ -916,90 +1133,44 @@
         <w:rPr>
           <w:b/>
           <w:bCs/>
-          <w:strike/>
-        </w:rPr>
-      </w:pPr>
-      <w:r>
-        <w:rPr>
-          <w:b/>
-          <w:bCs/>
-          <w:strike/>
-        </w:rPr>
-        <w:t>Shockwave</w:t>
-      </w:r>
-      <w:r>
-        <w:rPr>
-          <w:b/>
-          <w:bCs/>
-          <w:strike/>
-        </w:rPr>
+        </w:rPr>
+      </w:pPr>
+      <w:r>
+        <w:rPr>
+          <w:b/>
+          <w:bCs/>
+        </w:rPr>
+        <w:t>Let there be Light –</w:t>
+      </w:r>
+      <w:r>
+        <w:t xml:space="preserve"> Each player must </w:t>
+      </w:r>
+      <w:r>
+        <w:t>gather</w:t>
+      </w:r>
+      <w:r>
         <w:t xml:space="preserve"> </w:t>
       </w:r>
       <w:r>
-        <w:rPr>
-          <w:b/>
-          <w:bCs/>
-          <w:strike/>
-        </w:rPr>
-        <w:t xml:space="preserve">Phase </w:t>
-      </w:r>
-      <w:r>
-        <w:rPr>
-          <w:b/>
-          <w:bCs/>
-          <w:strike/>
-        </w:rPr>
-        <w:t>–</w:t>
-      </w:r>
-      <w:r>
-        <w:rPr>
-          <w:strike/>
-        </w:rPr>
-        <w:t xml:space="preserve"> This may incur a </w:t>
-      </w:r>
-      <w:r>
-        <w:rPr>
-          <w:strike/>
-        </w:rPr>
-        <w:t xml:space="preserve">random </w:t>
-      </w:r>
-      <w:r>
-        <w:rPr>
-          <w:strike/>
-        </w:rPr>
-        <w:t>penalty</w:t>
-      </w:r>
-      <w:r>
-        <w:rPr>
-          <w:strike/>
-        </w:rPr>
-        <w:t xml:space="preserve">, such as removing a percentage of the lighter elements, or a boon, such as creating rare materials which they can either keep or trade. Each player takes a card from the Shockwave Deck and places it face-up. </w:t>
-      </w:r>
-      <w:r>
-        <w:rPr>
-          <w:strike/>
-        </w:rPr>
-        <w:t>The Player Character card may increase or reduce the effect of the Shockwave Phase.</w:t>
-      </w:r>
-      <w:r>
-        <w:rPr>
-          <w:strike/>
-        </w:rPr>
-        <w:t xml:space="preserve"> The Shockwave Phase is essential for progressing the game, as this is the </w:t>
-      </w:r>
-      <w:r>
-        <w:rPr>
-          <w:i/>
-          <w:iCs/>
-          <w:strike/>
-        </w:rPr>
-        <w:t>only</w:t>
-      </w:r>
-      <w:r>
-        <w:rPr>
-          <w:strike/>
-        </w:rPr>
-        <w:t xml:space="preserve"> way to produce new elements.</w:t>
+        <w:t>hydrogen and helium</w:t>
+      </w:r>
+      <w:r>
+        <w:t xml:space="preserve"> to create The Sun. The resources act as currency and </w:t>
+      </w:r>
+      <w:r>
+        <w:t xml:space="preserve">may </w:t>
+      </w:r>
+      <w:r>
+        <w:t>require</w:t>
+      </w:r>
+      <w:r>
+        <w:t xml:space="preserve"> collaboration from</w:t>
+      </w:r>
+      <w:r>
+        <w:t xml:space="preserve"> the players</w:t>
+      </w:r>
+      <w:r>
+        <w:t>.</w:t>
       </w:r>
     </w:p>
     <w:p>
@@ -1021,25 +1192,81 @@
           <w:bCs/>
           <w:strike/>
         </w:rPr>
-        <w:t xml:space="preserve">Time Travel – </w:t>
-      </w:r>
-      <w:r>
-        <w:rPr>
+        <w:t>Shockwave</w:t>
+      </w:r>
+      <w:r>
+        <w:rPr>
+          <w:b/>
+          <w:bCs/>
           <w:strike/>
         </w:rPr>
-        <w:t xml:space="preserve">Each player’s ship has the ability to </w:t>
-      </w:r>
-      <w:r>
-        <w:rPr>
+        <w:t xml:space="preserve"> </w:t>
+      </w:r>
+      <w:r>
+        <w:rPr>
+          <w:b/>
+          <w:bCs/>
           <w:strike/>
         </w:rPr>
-        <w:t xml:space="preserve">move through time, but it needs to be powered by increasingly complex elements. </w:t>
-      </w:r>
-      <w:r>
-        <w:rPr>
+        <w:t xml:space="preserve">Phase </w:t>
+      </w:r>
+      <w:r>
+        <w:rPr>
+          <w:b/>
+          <w:bCs/>
           <w:strike/>
         </w:rPr>
-        <w:t xml:space="preserve">This option will only become available once the primary goal of each phase has been achieved. </w:t>
+        <w:t>–</w:t>
+      </w:r>
+      <w:r>
+        <w:rPr>
+          <w:strike/>
+        </w:rPr>
+        <w:t xml:space="preserve"> This may incur a </w:t>
+      </w:r>
+      <w:r>
+        <w:rPr>
+          <w:strike/>
+        </w:rPr>
+        <w:t xml:space="preserve">random </w:t>
+      </w:r>
+      <w:r>
+        <w:rPr>
+          <w:strike/>
+        </w:rPr>
+        <w:t>penalty</w:t>
+      </w:r>
+      <w:r>
+        <w:rPr>
+          <w:strike/>
+        </w:rPr>
+        <w:t xml:space="preserve">, such as removing a percentage of the lighter elements, or a boon, such as creating rare materials which they can either keep or trade. Each player takes a card from the Shockwave Deck and places it face-up. </w:t>
+      </w:r>
+      <w:r>
+        <w:rPr>
+          <w:strike/>
+        </w:rPr>
+        <w:t>The Player Character card may increase or reduce the effect of the Shockwave Phase.</w:t>
+      </w:r>
+      <w:r>
+        <w:rPr>
+          <w:strike/>
+        </w:rPr>
+        <w:t xml:space="preserve"> The Shockwave Phase is essential for progressing the game, as this is the </w:t>
+      </w:r>
+      <w:r>
+        <w:rPr>
+          <w:i/>
+          <w:iCs/>
+          <w:strike/>
+        </w:rPr>
+        <w:t>only</w:t>
+      </w:r>
+      <w:r>
+        <w:rPr>
+          <w:strike/>
+        </w:rPr>
+        <w:t xml:space="preserve"> way to produce new elements.</w:t>
       </w:r>
     </w:p>
     <w:p>
@@ -1052,87 +1279,48 @@
         <w:rPr>
           <w:b/>
           <w:bCs/>
-        </w:rPr>
-      </w:pPr>
-      <w:r>
-        <w:t>Players will have a choice of action on their turn. They can only perform one action (unless otherwise stated by an Action Card).</w:t>
-      </w:r>
-    </w:p>
-    <w:p>
-      <w:pPr>
-        <w:pStyle w:val="ListParagraph"/>
-        <w:rPr>
-          <w:b/>
-          <w:bCs/>
-        </w:rPr>
-      </w:pPr>
+          <w:strike/>
+        </w:rPr>
+      </w:pPr>
+      <w:r>
+        <w:rPr>
+          <w:b/>
+          <w:bCs/>
+          <w:strike/>
+        </w:rPr>
+        <w:t xml:space="preserve">Time Travel – </w:t>
+      </w:r>
+      <w:r>
+        <w:rPr>
+          <w:strike/>
+        </w:rPr>
+        <w:t xml:space="preserve">Each player’s ship has the ability to </w:t>
+      </w:r>
+      <w:r>
+        <w:rPr>
+          <w:strike/>
+        </w:rPr>
+        <w:t xml:space="preserve">move through time, but it needs to be powered by increasingly complex elements. </w:t>
+      </w:r>
+      <w:r>
+        <w:rPr>
+          <w:strike/>
+        </w:rPr>
+        <w:t xml:space="preserve">This option will only become available once the primary goal of each phase has been achieved. </w:t>
+      </w:r>
     </w:p>
     <w:p>
       <w:pPr>
         <w:pStyle w:val="ListParagraph"/>
         <w:numPr>
-          <w:ilvl w:val="1"/>
+          <w:ilvl w:val="0"/>
           <w:numId w:val="2"/>
         </w:numPr>
-        <w:rPr>
-          <w:b/>
-          <w:bCs/>
-        </w:rPr>
-      </w:pPr>
-      <w:r>
-        <w:t xml:space="preserve">Move through Time. The player will </w:t>
-      </w:r>
-      <w:r>
-        <w:t>roll the dice and advance a set number of squares. Advancing through time may grant access to more complex molecules.</w:t>
-      </w:r>
-    </w:p>
-    <w:p>
-      <w:pPr>
-        <w:pStyle w:val="ListParagraph"/>
-        <w:numPr>
-          <w:ilvl w:val="1"/>
-          <w:numId w:val="2"/>
-        </w:numPr>
-        <w:rPr>
-          <w:b/>
-          <w:bCs/>
-        </w:rPr>
-      </w:pPr>
-      <w:r>
-        <w:t>Take an Action Card.</w:t>
-      </w:r>
-    </w:p>
-    <w:p>
-      <w:pPr>
-        <w:pStyle w:val="ListParagraph"/>
-        <w:numPr>
-          <w:ilvl w:val="1"/>
-          <w:numId w:val="2"/>
-        </w:numPr>
-        <w:rPr>
-          <w:b/>
-          <w:bCs/>
-        </w:rPr>
       </w:pPr>
       <w:r>
         <w:lastRenderedPageBreak/>
-        <w:t>Gather a resource.</w:t>
-      </w:r>
-    </w:p>
-    <w:p>
-      <w:pPr>
-        <w:pStyle w:val="ListParagraph"/>
-        <w:numPr>
-          <w:ilvl w:val="1"/>
-          <w:numId w:val="2"/>
-        </w:numPr>
-        <w:rPr>
-          <w:b/>
-          <w:bCs/>
-        </w:rPr>
-      </w:pPr>
-    </w:p>
-    <w:p>
+        <w:t xml:space="preserve">Players will have a choice of action on their turn. </w:t>
+      </w:r>
       <w:r>
         <w:t>As the player’s sun grows, more elements will become available, but beware a premature supernova.</w:t>
       </w:r>
@@ -1152,18 +1340,28 @@
         <w:rPr>
           <w:b/>
           <w:bCs/>
-        </w:rPr>
-      </w:pPr>
-      <w:r>
-        <w:rPr>
-          <w:b/>
-          <w:bCs/>
+          <w:color w:val="FF0000"/>
+        </w:rPr>
+      </w:pPr>
+      <w:r>
+        <w:rPr>
+          <w:b/>
+          <w:bCs/>
+          <w:color w:val="FF0000"/>
         </w:rPr>
         <w:t>Player Character Cards.</w:t>
       </w:r>
     </w:p>
     <w:p>
-      <w:r>
+      <w:pPr>
+        <w:rPr>
+          <w:color w:val="FF0000"/>
+        </w:rPr>
+      </w:pPr>
+      <w:r>
+        <w:rPr>
+          <w:color w:val="FF0000"/>
+        </w:rPr>
         <w:t>Each card contains:</w:t>
       </w:r>
     </w:p>
@@ -1174,8 +1372,14 @@
           <w:ilvl w:val="0"/>
           <w:numId w:val="3"/>
         </w:numPr>
-      </w:pPr>
-      <w:r>
+        <w:rPr>
+          <w:color w:val="FF0000"/>
+        </w:rPr>
+      </w:pPr>
+      <w:r>
+        <w:rPr>
+          <w:color w:val="FF0000"/>
+        </w:rPr>
         <w:t>Name and image of the character.</w:t>
       </w:r>
     </w:p>
@@ -1186,8 +1390,14 @@
           <w:ilvl w:val="0"/>
           <w:numId w:val="3"/>
         </w:numPr>
-      </w:pPr>
-      <w:r>
+        <w:rPr>
+          <w:color w:val="FF0000"/>
+        </w:rPr>
+      </w:pPr>
+      <w:r>
+        <w:rPr>
+          <w:color w:val="FF0000"/>
+        </w:rPr>
         <w:t>A brief background to the character – Some fictional flavour that can tie into their special abilities.</w:t>
       </w:r>
     </w:p>
@@ -1198,11 +1408,20 @@
           <w:ilvl w:val="0"/>
           <w:numId w:val="3"/>
         </w:numPr>
-      </w:pPr>
-      <w:r>
+        <w:rPr>
+          <w:color w:val="FF0000"/>
+        </w:rPr>
+      </w:pPr>
+      <w:r>
+        <w:rPr>
+          <w:color w:val="FF0000"/>
+        </w:rPr>
         <w:t xml:space="preserve">Special Abilities – For example, Helios may have a buff </w:t>
       </w:r>
       <w:r>
+        <w:rPr>
+          <w:color w:val="FF0000"/>
+        </w:rPr>
         <w:t>towards gathering more Hydrogen to create the sun. (For a buff there ought to be a nerf, or if there is only a buff then it may be more effective in the early, mid or late game. It shouldn’t be an overall advantage).</w:t>
       </w:r>
     </w:p>
@@ -1211,12 +1430,14 @@
         <w:rPr>
           <w:b/>
           <w:bCs/>
-        </w:rPr>
-      </w:pPr>
-      <w:r>
-        <w:rPr>
-          <w:b/>
-          <w:bCs/>
+          <w:color w:val="FF0000"/>
+        </w:rPr>
+      </w:pPr>
+      <w:r>
+        <w:rPr>
+          <w:b/>
+          <w:bCs/>
+          <w:color w:val="FF0000"/>
         </w:rPr>
         <w:t>Secret Agenda Card</w:t>
       </w:r>
@@ -1224,12 +1445,21 @@
         <w:rPr>
           <w:b/>
           <w:bCs/>
+          <w:color w:val="FF0000"/>
         </w:rPr>
         <w:t>s.</w:t>
       </w:r>
     </w:p>
     <w:p>
-      <w:r>
+      <w:pPr>
+        <w:rPr>
+          <w:color w:val="FF0000"/>
+        </w:rPr>
+      </w:pPr>
+      <w:r>
+        <w:rPr>
+          <w:color w:val="FF0000"/>
+        </w:rPr>
         <w:t>Each card contains:</w:t>
       </w:r>
     </w:p>
@@ -1240,8 +1470,14 @@
           <w:ilvl w:val="0"/>
           <w:numId w:val="4"/>
         </w:numPr>
-      </w:pPr>
-      <w:r>
+        <w:rPr>
+          <w:color w:val="FF0000"/>
+        </w:rPr>
+      </w:pPr>
+      <w:r>
+        <w:rPr>
+          <w:color w:val="FF0000"/>
+        </w:rPr>
         <w:t>An image representing the agenda.</w:t>
       </w:r>
     </w:p>
@@ -1252,14 +1488,26 @@
           <w:ilvl w:val="0"/>
           <w:numId w:val="4"/>
         </w:numPr>
-      </w:pPr>
-      <w:r>
+        <w:rPr>
+          <w:color w:val="FF0000"/>
+        </w:rPr>
+      </w:pPr>
+      <w:r>
+        <w:rPr>
+          <w:color w:val="FF0000"/>
+        </w:rPr>
         <w:t>The agenda (</w:t>
       </w:r>
       <w:r>
+        <w:rPr>
+          <w:color w:val="FF0000"/>
+        </w:rPr>
         <w:t>C</w:t>
       </w:r>
       <w:r>
+        <w:rPr>
+          <w:color w:val="FF0000"/>
+        </w:rPr>
         <w:t>ollect X amount of X – These will be a mixture of common and rare materials in order to give the players the opportunity to start fulfilling their agenda early on in the game).</w:t>
       </w:r>
     </w:p>
@@ -1270,14 +1518,26 @@
           <w:ilvl w:val="0"/>
           <w:numId w:val="4"/>
         </w:numPr>
-      </w:pPr>
-      <w:r>
+        <w:rPr>
+          <w:color w:val="FF0000"/>
+        </w:rPr>
+      </w:pPr>
+      <w:r>
+        <w:rPr>
+          <w:color w:val="FF0000"/>
+        </w:rPr>
         <w:t>The number of points awarded on succe</w:t>
       </w:r>
       <w:r>
+        <w:rPr>
+          <w:color w:val="FF0000"/>
+        </w:rPr>
         <w:t>s</w:t>
       </w:r>
       <w:r>
+        <w:rPr>
+          <w:color w:val="FF0000"/>
+        </w:rPr>
         <w:t>sful completion of the agenda.</w:t>
       </w:r>
     </w:p>

</xml_diff>